<commit_message>
add node.js and express code and notes till chapter 6
</commit_message>
<xml_diff>
--- a/AWS/AWS DynamoDB/Notes.docx
+++ b/AWS/AWS DynamoDB/Notes.docx
@@ -1,6 +1,6 @@
 
 <file path=word/document.xml><?xml version="1.0" encoding="utf-8"?>
-<w:document xmlns:wpc="http://schemas.microsoft.com/office/word/2010/wordprocessingCanvas" xmlns:cx="http://schemas.microsoft.com/office/drawing/2014/chartex" xmlns:cx1="http://schemas.microsoft.com/office/drawing/2015/9/8/chartex" xmlns:cx2="http://schemas.microsoft.com/office/drawing/2015/10/21/chartex" xmlns:cx3="http://schemas.microsoft.com/office/drawing/2016/5/9/chartex" xmlns:cx4="http://schemas.microsoft.com/office/drawing/2016/5/10/chartex" xmlns:cx5="http://schemas.microsoft.com/office/drawing/2016/5/11/chartex" xmlns:cx6="http://schemas.microsoft.com/office/drawing/2016/5/12/chartex" xmlns:cx7="http://schemas.microsoft.com/office/drawing/2016/5/13/chartex" xmlns:cx8="http://schemas.microsoft.com/office/drawing/2016/5/14/chartex" xmlns:mc="http://schemas.openxmlformats.org/markup-compatibility/2006" xmlns:aink="http://schemas.microsoft.com/office/drawing/2016/ink" xmlns:am3d="http://schemas.microsoft.com/office/drawing/2017/model3d" xmlns:o="urn:schemas-microsoft-com:office:office" xmlns:oel="http://schemas.microsoft.com/office/2019/extlst" xmlns:r="http://schemas.openxmlformats.org/officeDocument/2006/relationships" xmlns:m="http://schemas.openxmlformats.org/officeDocument/2006/math" xmlns:v="urn:schemas-microsoft-com:vml" xmlns:wp14="http://schemas.microsoft.com/office/word/2010/wordprocessingDrawing" xmlns:wp="http://schemas.openxmlformats.org/drawingml/2006/wordprocessingDrawing" xmlns:w10="urn:schemas-microsoft-com:office:word" xmlns:w="http://schemas.openxmlformats.org/wordprocessingml/2006/main" xmlns:w14="http://schemas.microsoft.com/office/word/2010/wordml" xmlns:w15="http://schemas.microsoft.com/office/word/2012/wordml" xmlns:w16cex="http://schemas.microsoft.com/office/word/2018/wordml/cex" xmlns:w16cid="http://schemas.microsoft.com/office/word/2016/wordml/cid" xmlns:w16="http://schemas.microsoft.com/office/word/2018/wordml" xmlns:w16du="http://schemas.microsoft.com/office/word/2023/wordml/word16du" xmlns:w16sdtdh="http://schemas.microsoft.com/office/word/2020/wordml/sdtdatahash" xmlns:w16sdtfl="http://schemas.microsoft.com/office/word/2024/wordml/sdtformatlock" xmlns:w16se="http://schemas.microsoft.com/office/word/2015/wordml/symex" xmlns:wpg="http://schemas.microsoft.com/office/word/2010/wordprocessingGroup" xmlns:wpi="http://schemas.microsoft.com/office/word/2010/wordprocessingInk" xmlns:wne="http://schemas.microsoft.com/office/word/2006/wordml" xmlns:wps="http://schemas.microsoft.com/office/word/2010/wordprocessingShape" mc:Ignorable="w14 w15 w16se w16cid w16 w16cex w16sdtdh w16sdtfl w16du wp14">
+<w:document xmlns:wpc="http://schemas.microsoft.com/office/word/2010/wordprocessingCanvas" xmlns:cx="http://schemas.microsoft.com/office/drawing/2014/chartex" xmlns:cx1="http://schemas.microsoft.com/office/drawing/2015/9/8/chartex" xmlns:cx2="http://schemas.microsoft.com/office/drawing/2015/10/21/chartex" xmlns:cx3="http://schemas.microsoft.com/office/drawing/2016/5/9/chartex" xmlns:cx4="http://schemas.microsoft.com/office/drawing/2016/5/10/chartex" xmlns:cx5="http://schemas.microsoft.com/office/drawing/2016/5/11/chartex" xmlns:cx6="http://schemas.microsoft.com/office/drawing/2016/5/12/chartex" xmlns:cx7="http://schemas.microsoft.com/office/drawing/2016/5/13/chartex" xmlns:cx8="http://schemas.microsoft.com/office/drawing/2016/5/14/chartex" xmlns:mc="http://schemas.openxmlformats.org/markup-compatibility/2006" xmlns:aink="http://schemas.microsoft.com/office/drawing/2016/ink" xmlns:am3d="http://schemas.microsoft.com/office/drawing/2017/model3d" xmlns:o="urn:schemas-microsoft-com:office:office" xmlns:oel="http://schemas.microsoft.com/office/2019/extlst" xmlns:r="http://schemas.openxmlformats.org/officeDocument/2006/relationships" xmlns:m="http://schemas.openxmlformats.org/officeDocument/2006/math" xmlns:v="urn:schemas-microsoft-com:vml" xmlns:wp14="http://schemas.microsoft.com/office/word/2010/wordprocessingDrawing" xmlns:wp="http://schemas.openxmlformats.org/drawingml/2006/wordprocessingDrawing" xmlns:w10="urn:schemas-microsoft-com:office:word" xmlns:w="http://schemas.openxmlformats.org/wordprocessingml/2006/main" xmlns:w14="http://schemas.microsoft.com/office/word/2010/wordml" xmlns:w15="http://schemas.microsoft.com/office/word/2012/wordml" xmlns:w16cei="http://schemas.microsoft.com/office/word/2026/wordml/cei" xmlns:w16cex="http://schemas.microsoft.com/office/word/2018/wordml/cex" xmlns:w16cid="http://schemas.microsoft.com/office/word/2016/wordml/cid" xmlns:w16="http://schemas.microsoft.com/office/word/2018/wordml" xmlns:w16du="http://schemas.microsoft.com/office/word/2023/wordml/word16du" xmlns:w16sdtdh="http://schemas.microsoft.com/office/word/2020/wordml/sdtdatahash" xmlns:w16sdtfl="http://schemas.microsoft.com/office/word/2024/wordml/sdtformatlock" xmlns:w16se="http://schemas.microsoft.com/office/word/2015/wordml/symex" xmlns:wpg="http://schemas.microsoft.com/office/word/2010/wordprocessingGroup" xmlns:wpi="http://schemas.microsoft.com/office/word/2010/wordprocessingInk" xmlns:wne="http://schemas.microsoft.com/office/word/2006/wordml" xmlns:wps="http://schemas.microsoft.com/office/word/2010/wordprocessingShape" mc:Ignorable="w14 w15 w16se w16cid w16 w16cex w16sdtdh w16sdtfl w16du wp14">
   <w:body>
     <w:p>
       <w:pPr>
@@ -31,17 +31,225 @@
     <w:p>
       <w:pPr>
         <w:rPr>
-          <w:color w:val="000000" w:themeColor="text1"/>
+          <w:b/>
+          <w:bCs/>
+          <w:color w:val="000000" w:themeColor="text1"/>
+          <w:sz w:val="28"/>
+          <w:szCs w:val="28"/>
+          <w:u w:val="single"/>
           <w:lang w:val="en-US"/>
         </w:rPr>
       </w:pPr>
       <w:r>
         <w:rPr>
-          <w:color w:val="000000" w:themeColor="text1"/>
+          <w:b/>
+          <w:bCs/>
+          <w:color w:val="000000" w:themeColor="text1"/>
+          <w:sz w:val="28"/>
+          <w:szCs w:val="28"/>
+          <w:u w:val="single"/>
           <w:lang w:val="en-US"/>
         </w:rPr>
-        <w:t>Partition key:</w:t>
-      </w:r>
+        <w:t>Partition key</w:t>
+      </w:r>
+      <w:r>
+        <w:rPr>
+          <w:b/>
+          <w:bCs/>
+          <w:color w:val="000000" w:themeColor="text1"/>
+          <w:sz w:val="28"/>
+          <w:szCs w:val="28"/>
+          <w:u w:val="single"/>
+          <w:lang w:val="en-US"/>
+        </w:rPr>
+        <w:t>:</w:t>
+      </w:r>
+    </w:p>
+    <w:p>
+      <w:pPr>
+        <w:pStyle w:val="ListParagraph"/>
+        <w:numPr>
+          <w:ilvl w:val="0"/>
+          <w:numId w:val="2"/>
+        </w:numPr>
+        <w:rPr>
+          <w:color w:val="000000" w:themeColor="text1"/>
+        </w:rPr>
+      </w:pPr>
+      <w:r>
+        <w:rPr>
+          <w:color w:val="000000" w:themeColor="text1"/>
+        </w:rPr>
+        <w:t xml:space="preserve">The PK determines </w:t>
+      </w:r>
+      <w:r>
+        <w:rPr>
+          <w:color w:val="000000" w:themeColor="text1"/>
+        </w:rPr>
+        <w:t>where DynamoDB looks for an item</w:t>
+      </w:r>
+      <w:r>
+        <w:rPr>
+          <w:color w:val="000000" w:themeColor="text1"/>
+        </w:rPr>
+        <w:t xml:space="preserve"> and how data is distributed internally.</w:t>
+      </w:r>
+    </w:p>
+    <w:p>
+      <w:pPr>
+        <w:pStyle w:val="ListParagraph"/>
+        <w:numPr>
+          <w:ilvl w:val="0"/>
+          <w:numId w:val="2"/>
+        </w:numPr>
+        <w:rPr>
+          <w:color w:val="000000" w:themeColor="text1"/>
+        </w:rPr>
+      </w:pPr>
+      <w:r>
+        <w:rPr>
+          <w:color w:val="000000" w:themeColor="text1"/>
+        </w:rPr>
+        <w:t xml:space="preserve">A PK lets DynamoDB </w:t>
+      </w:r>
+      <w:r>
+        <w:rPr>
+          <w:color w:val="000000" w:themeColor="text1"/>
+        </w:rPr>
+        <w:t>directly locate the relevant partition</w:t>
+      </w:r>
+      <w:r>
+        <w:rPr>
+          <w:color w:val="000000" w:themeColor="text1"/>
+        </w:rPr>
+        <w:t xml:space="preserve"> instead of scanning the whole table.</w:t>
+      </w:r>
+    </w:p>
+    <w:p>
+      <w:pPr>
+        <w:pStyle w:val="ListParagraph"/>
+        <w:numPr>
+          <w:ilvl w:val="0"/>
+          <w:numId w:val="2"/>
+        </w:numPr>
+        <w:rPr>
+          <w:color w:val="000000" w:themeColor="text1"/>
+        </w:rPr>
+      </w:pPr>
+      <w:r>
+        <w:rPr>
+          <w:color w:val="000000" w:themeColor="text1"/>
+        </w:rPr>
+        <w:t xml:space="preserve">Using a Partition </w:t>
+      </w:r>
+      <w:proofErr w:type="gramStart"/>
+      <w:r>
+        <w:rPr>
+          <w:color w:val="000000" w:themeColor="text1"/>
+        </w:rPr>
+        <w:t>key</w:t>
+      </w:r>
+      <w:proofErr w:type="gramEnd"/>
+      <w:r>
+        <w:rPr>
+          <w:color w:val="000000" w:themeColor="text1"/>
+        </w:rPr>
+        <w:t xml:space="preserve"> we group our values</w:t>
+      </w:r>
+    </w:p>
+    <w:p>
+      <w:pPr>
+        <w:pStyle w:val="ListParagraph"/>
+        <w:numPr>
+          <w:ilvl w:val="0"/>
+          <w:numId w:val="2"/>
+        </w:numPr>
+        <w:rPr>
+          <w:color w:val="000000" w:themeColor="text1"/>
+        </w:rPr>
+      </w:pPr>
+      <w:r>
+        <w:rPr>
+          <w:color w:val="000000" w:themeColor="text1"/>
+        </w:rPr>
+        <w:t>Cardinality = number of distinct PK values.</w:t>
+      </w:r>
+      <w:r>
+        <w:rPr>
+          <w:color w:val="000000" w:themeColor="text1"/>
+        </w:rPr>
+        <w:t xml:space="preserve"> </w:t>
+      </w:r>
+      <w:r>
+        <w:rPr>
+          <w:color w:val="000000" w:themeColor="text1"/>
+        </w:rPr>
+        <w:t>High enough cardinality + evenly distributed traffic.</w:t>
+      </w:r>
+    </w:p>
+    <w:p>
+      <w:pPr>
+        <w:pStyle w:val="ListParagraph"/>
+        <w:numPr>
+          <w:ilvl w:val="0"/>
+          <w:numId w:val="2"/>
+        </w:numPr>
+        <w:rPr>
+          <w:color w:val="000000" w:themeColor="text1"/>
+        </w:rPr>
+      </w:pPr>
+      <w:r>
+        <w:rPr>
+          <w:color w:val="000000" w:themeColor="text1"/>
+        </w:rPr>
+        <w:t>cardinality = how many distinct PK values you have, not how evenly they're distributed.</w:t>
+      </w:r>
+      <w:r>
+        <w:rPr>
+          <w:color w:val="000000" w:themeColor="text1"/>
+        </w:rPr>
+        <w:t xml:space="preserve"> High cardinality is good </w:t>
+      </w:r>
+      <w:proofErr w:type="gramStart"/>
+      <w:r>
+        <w:rPr>
+          <w:color w:val="000000" w:themeColor="text1"/>
+        </w:rPr>
+        <w:t>as long as</w:t>
+      </w:r>
+      <w:proofErr w:type="gramEnd"/>
+      <w:r>
+        <w:rPr>
+          <w:color w:val="000000" w:themeColor="text1"/>
+        </w:rPr>
+        <w:t xml:space="preserve"> the distribution is fair</w:t>
+      </w:r>
+    </w:p>
+    <w:p>
+      <w:pPr>
+        <w:pStyle w:val="ListParagraph"/>
+        <w:numPr>
+          <w:ilvl w:val="0"/>
+          <w:numId w:val="2"/>
+        </w:numPr>
+        <w:rPr>
+          <w:color w:val="000000" w:themeColor="text1"/>
+        </w:rPr>
+      </w:pPr>
+      <w:r>
+        <w:rPr>
+          <w:color w:val="000000" w:themeColor="text1"/>
+        </w:rPr>
+        <w:t>Good/even distribution is more important than extremely high cardinality.</w:t>
+      </w:r>
+    </w:p>
+    <w:p>
+      <w:pPr>
+        <w:pStyle w:val="ListParagraph"/>
+        <w:rPr>
+          <w:color w:val="000000" w:themeColor="text1"/>
+        </w:rPr>
+      </w:pPr>
     </w:p>
     <w:p>
       <w:pPr>
@@ -148,6 +356,243 @@
     </w:sectPr>
   </w:body>
 </w:document>
+</file>
+
+<file path=word/numbering.xml><?xml version="1.0" encoding="utf-8"?>
+<w:numbering xmlns:wpc="http://schemas.microsoft.com/office/word/2010/wordprocessingCanvas" xmlns:cx="http://schemas.microsoft.com/office/drawing/2014/chartex" xmlns:cx1="http://schemas.microsoft.com/office/drawing/2015/9/8/chartex" xmlns:cx2="http://schemas.microsoft.com/office/drawing/2015/10/21/chartex" xmlns:cx3="http://schemas.microsoft.com/office/drawing/2016/5/9/chartex" xmlns:cx4="http://schemas.microsoft.com/office/drawing/2016/5/10/chartex" xmlns:cx5="http://schemas.microsoft.com/office/drawing/2016/5/11/chartex" xmlns:cx6="http://schemas.microsoft.com/office/drawing/2016/5/12/chartex" xmlns:cx7="http://schemas.microsoft.com/office/drawing/2016/5/13/chartex" xmlns:cx8="http://schemas.microsoft.com/office/drawing/2016/5/14/chartex" xmlns:mc="http://schemas.openxmlformats.org/markup-compatibility/2006" xmlns:aink="http://schemas.microsoft.com/office/drawing/2016/ink" xmlns:am3d="http://schemas.microsoft.com/office/drawing/2017/model3d" xmlns:o="urn:schemas-microsoft-com:office:office" xmlns:oel="http://schemas.microsoft.com/office/2019/extlst" xmlns:r="http://schemas.openxmlformats.org/officeDocument/2006/relationships" xmlns:m="http://schemas.openxmlformats.org/officeDocument/2006/math" xmlns:v="urn:schemas-microsoft-com:vml" xmlns:wp14="http://schemas.microsoft.com/office/word/2010/wordprocessingDrawing" xmlns:wp="http://schemas.openxmlformats.org/drawingml/2006/wordprocessingDrawing" xmlns:w10="urn:schemas-microsoft-com:office:word" xmlns:w="http://schemas.openxmlformats.org/wordprocessingml/2006/main" xmlns:w14="http://schemas.microsoft.com/office/word/2010/wordml" xmlns:w15="http://schemas.microsoft.com/office/word/2012/wordml" xmlns:w16cei="http://schemas.microsoft.com/office/word/2026/wordml/cei" xmlns:w16cex="http://schemas.microsoft.com/office/word/2018/wordml/cex" xmlns:w16cid="http://schemas.microsoft.com/office/word/2016/wordml/cid" xmlns:w16="http://schemas.microsoft.com/office/word/2018/wordml" xmlns:w16du="http://schemas.microsoft.com/office/word/2023/wordml/word16du" xmlns:w16sdtdh="http://schemas.microsoft.com/office/word/2020/wordml/sdtdatahash" xmlns:w16sdtfl="http://schemas.microsoft.com/office/word/2024/wordml/sdtformatlock" xmlns:w16se="http://schemas.microsoft.com/office/word/2015/wordml/symex" xmlns:wpg="http://schemas.microsoft.com/office/word/2010/wordprocessingGroup" xmlns:wpi="http://schemas.microsoft.com/office/word/2010/wordprocessingInk" xmlns:wne="http://schemas.microsoft.com/office/word/2006/wordml" xmlns:wps="http://schemas.microsoft.com/office/word/2010/wordprocessingShape" mc:Ignorable="w14 w15 w16se w16cid w16 w16cex w16sdtdh w16sdtfl w16du wp14">
+  <w:abstractNum w:abstractNumId="0" w15:restartNumberingAfterBreak="0">
+    <w:nsid w:val="5C934C91"/>
+    <w:multiLevelType w:val="hybridMultilevel"/>
+    <w:tmpl w:val="2DFEECD0"/>
+    <w:lvl w:ilvl="0" w:tplc="04090001">
+      <w:start w:val="1"/>
+      <w:numFmt w:val="bullet"/>
+      <w:lvlText w:val=""/>
+      <w:lvlJc w:val="left"/>
+      <w:pPr>
+        <w:ind w:left="720" w:hanging="360"/>
+      </w:pPr>
+      <w:rPr>
+        <w:rFonts w:ascii="Symbol" w:hAnsi="Symbol" w:hint="default"/>
+      </w:rPr>
+    </w:lvl>
+    <w:lvl w:ilvl="1" w:tplc="04090003" w:tentative="1">
+      <w:start w:val="1"/>
+      <w:numFmt w:val="bullet"/>
+      <w:lvlText w:val="o"/>
+      <w:lvlJc w:val="left"/>
+      <w:pPr>
+        <w:ind w:left="1440" w:hanging="360"/>
+      </w:pPr>
+      <w:rPr>
+        <w:rFonts w:ascii="Courier New" w:hAnsi="Courier New" w:cs="Courier New" w:hint="default"/>
+      </w:rPr>
+    </w:lvl>
+    <w:lvl w:ilvl="2" w:tplc="04090005" w:tentative="1">
+      <w:start w:val="1"/>
+      <w:numFmt w:val="bullet"/>
+      <w:lvlText w:val=""/>
+      <w:lvlJc w:val="left"/>
+      <w:pPr>
+        <w:ind w:left="2160" w:hanging="360"/>
+      </w:pPr>
+      <w:rPr>
+        <w:rFonts w:ascii="Wingdings" w:hAnsi="Wingdings" w:hint="default"/>
+      </w:rPr>
+    </w:lvl>
+    <w:lvl w:ilvl="3" w:tplc="04090001" w:tentative="1">
+      <w:start w:val="1"/>
+      <w:numFmt w:val="bullet"/>
+      <w:lvlText w:val=""/>
+      <w:lvlJc w:val="left"/>
+      <w:pPr>
+        <w:ind w:left="2880" w:hanging="360"/>
+      </w:pPr>
+      <w:rPr>
+        <w:rFonts w:ascii="Symbol" w:hAnsi="Symbol" w:hint="default"/>
+      </w:rPr>
+    </w:lvl>
+    <w:lvl w:ilvl="4" w:tplc="04090003" w:tentative="1">
+      <w:start w:val="1"/>
+      <w:numFmt w:val="bullet"/>
+      <w:lvlText w:val="o"/>
+      <w:lvlJc w:val="left"/>
+      <w:pPr>
+        <w:ind w:left="3600" w:hanging="360"/>
+      </w:pPr>
+      <w:rPr>
+        <w:rFonts w:ascii="Courier New" w:hAnsi="Courier New" w:cs="Courier New" w:hint="default"/>
+      </w:rPr>
+    </w:lvl>
+    <w:lvl w:ilvl="5" w:tplc="04090005" w:tentative="1">
+      <w:start w:val="1"/>
+      <w:numFmt w:val="bullet"/>
+      <w:lvlText w:val=""/>
+      <w:lvlJc w:val="left"/>
+      <w:pPr>
+        <w:ind w:left="4320" w:hanging="360"/>
+      </w:pPr>
+      <w:rPr>
+        <w:rFonts w:ascii="Wingdings" w:hAnsi="Wingdings" w:hint="default"/>
+      </w:rPr>
+    </w:lvl>
+    <w:lvl w:ilvl="6" w:tplc="04090001" w:tentative="1">
+      <w:start w:val="1"/>
+      <w:numFmt w:val="bullet"/>
+      <w:lvlText w:val=""/>
+      <w:lvlJc w:val="left"/>
+      <w:pPr>
+        <w:ind w:left="5040" w:hanging="360"/>
+      </w:pPr>
+      <w:rPr>
+        <w:rFonts w:ascii="Symbol" w:hAnsi="Symbol" w:hint="default"/>
+      </w:rPr>
+    </w:lvl>
+    <w:lvl w:ilvl="7" w:tplc="04090003" w:tentative="1">
+      <w:start w:val="1"/>
+      <w:numFmt w:val="bullet"/>
+      <w:lvlText w:val="o"/>
+      <w:lvlJc w:val="left"/>
+      <w:pPr>
+        <w:ind w:left="5760" w:hanging="360"/>
+      </w:pPr>
+      <w:rPr>
+        <w:rFonts w:ascii="Courier New" w:hAnsi="Courier New" w:cs="Courier New" w:hint="default"/>
+      </w:rPr>
+    </w:lvl>
+    <w:lvl w:ilvl="8" w:tplc="04090005" w:tentative="1">
+      <w:start w:val="1"/>
+      <w:numFmt w:val="bullet"/>
+      <w:lvlText w:val=""/>
+      <w:lvlJc w:val="left"/>
+      <w:pPr>
+        <w:ind w:left="6480" w:hanging="360"/>
+      </w:pPr>
+      <w:rPr>
+        <w:rFonts w:ascii="Wingdings" w:hAnsi="Wingdings" w:hint="default"/>
+      </w:rPr>
+    </w:lvl>
+  </w:abstractNum>
+  <w:abstractNum w:abstractNumId="1" w15:restartNumberingAfterBreak="0">
+    <w:nsid w:val="67BC70E3"/>
+    <w:multiLevelType w:val="hybridMultilevel"/>
+    <w:tmpl w:val="28FC9A8A"/>
+    <w:lvl w:ilvl="0" w:tplc="04090001">
+      <w:start w:val="1"/>
+      <w:numFmt w:val="bullet"/>
+      <w:lvlText w:val=""/>
+      <w:lvlJc w:val="left"/>
+      <w:pPr>
+        <w:ind w:left="720" w:hanging="360"/>
+      </w:pPr>
+      <w:rPr>
+        <w:rFonts w:ascii="Symbol" w:hAnsi="Symbol" w:hint="default"/>
+      </w:rPr>
+    </w:lvl>
+    <w:lvl w:ilvl="1" w:tplc="04090003" w:tentative="1">
+      <w:start w:val="1"/>
+      <w:numFmt w:val="bullet"/>
+      <w:lvlText w:val="o"/>
+      <w:lvlJc w:val="left"/>
+      <w:pPr>
+        <w:ind w:left="1440" w:hanging="360"/>
+      </w:pPr>
+      <w:rPr>
+        <w:rFonts w:ascii="Courier New" w:hAnsi="Courier New" w:cs="Courier New" w:hint="default"/>
+      </w:rPr>
+    </w:lvl>
+    <w:lvl w:ilvl="2" w:tplc="04090005" w:tentative="1">
+      <w:start w:val="1"/>
+      <w:numFmt w:val="bullet"/>
+      <w:lvlText w:val=""/>
+      <w:lvlJc w:val="left"/>
+      <w:pPr>
+        <w:ind w:left="2160" w:hanging="360"/>
+      </w:pPr>
+      <w:rPr>
+        <w:rFonts w:ascii="Wingdings" w:hAnsi="Wingdings" w:hint="default"/>
+      </w:rPr>
+    </w:lvl>
+    <w:lvl w:ilvl="3" w:tplc="04090001" w:tentative="1">
+      <w:start w:val="1"/>
+      <w:numFmt w:val="bullet"/>
+      <w:lvlText w:val=""/>
+      <w:lvlJc w:val="left"/>
+      <w:pPr>
+        <w:ind w:left="2880" w:hanging="360"/>
+      </w:pPr>
+      <w:rPr>
+        <w:rFonts w:ascii="Symbol" w:hAnsi="Symbol" w:hint="default"/>
+      </w:rPr>
+    </w:lvl>
+    <w:lvl w:ilvl="4" w:tplc="04090003" w:tentative="1">
+      <w:start w:val="1"/>
+      <w:numFmt w:val="bullet"/>
+      <w:lvlText w:val="o"/>
+      <w:lvlJc w:val="left"/>
+      <w:pPr>
+        <w:ind w:left="3600" w:hanging="360"/>
+      </w:pPr>
+      <w:rPr>
+        <w:rFonts w:ascii="Courier New" w:hAnsi="Courier New" w:cs="Courier New" w:hint="default"/>
+      </w:rPr>
+    </w:lvl>
+    <w:lvl w:ilvl="5" w:tplc="04090005" w:tentative="1">
+      <w:start w:val="1"/>
+      <w:numFmt w:val="bullet"/>
+      <w:lvlText w:val=""/>
+      <w:lvlJc w:val="left"/>
+      <w:pPr>
+        <w:ind w:left="4320" w:hanging="360"/>
+      </w:pPr>
+      <w:rPr>
+        <w:rFonts w:ascii="Wingdings" w:hAnsi="Wingdings" w:hint="default"/>
+      </w:rPr>
+    </w:lvl>
+    <w:lvl w:ilvl="6" w:tplc="04090001" w:tentative="1">
+      <w:start w:val="1"/>
+      <w:numFmt w:val="bullet"/>
+      <w:lvlText w:val=""/>
+      <w:lvlJc w:val="left"/>
+      <w:pPr>
+        <w:ind w:left="5040" w:hanging="360"/>
+      </w:pPr>
+      <w:rPr>
+        <w:rFonts w:ascii="Symbol" w:hAnsi="Symbol" w:hint="default"/>
+      </w:rPr>
+    </w:lvl>
+    <w:lvl w:ilvl="7" w:tplc="04090003" w:tentative="1">
+      <w:start w:val="1"/>
+      <w:numFmt w:val="bullet"/>
+      <w:lvlText w:val="o"/>
+      <w:lvlJc w:val="left"/>
+      <w:pPr>
+        <w:ind w:left="5760" w:hanging="360"/>
+      </w:pPr>
+      <w:rPr>
+        <w:rFonts w:ascii="Courier New" w:hAnsi="Courier New" w:cs="Courier New" w:hint="default"/>
+      </w:rPr>
+    </w:lvl>
+    <w:lvl w:ilvl="8" w:tplc="04090005" w:tentative="1">
+      <w:start w:val="1"/>
+      <w:numFmt w:val="bullet"/>
+      <w:lvlText w:val=""/>
+      <w:lvlJc w:val="left"/>
+      <w:pPr>
+        <w:ind w:left="6480" w:hanging="360"/>
+      </w:pPr>
+      <w:rPr>
+        <w:rFonts w:ascii="Wingdings" w:hAnsi="Wingdings" w:hint="default"/>
+      </w:rPr>
+    </w:lvl>
+  </w:abstractNum>
+  <w:num w:numId="1" w16cid:durableId="634338226">
+    <w:abstractNumId w:val="0"/>
+  </w:num>
+  <w:num w:numId="2" w16cid:durableId="1338463573">
+    <w:abstractNumId w:val="1"/>
+  </w:num>
+</w:numbering>
 </file>
 
 <file path=word/styles.xml><?xml version="1.0" encoding="utf-8"?>
@@ -752,7 +1197,6 @@
   <w:style w:type="character" w:default="1" w:styleId="DefaultParagraphFont">
     <w:name w:val="Default Paragraph Font"/>
     <w:uiPriority w:val="1"/>
-    <w:semiHidden/>
     <w:unhideWhenUsed/>
   </w:style>
   <w:style w:type="table" w:default="1" w:styleId="TableNormal">

</xml_diff>

<commit_message>
add more dynamo notes
</commit_message>
<xml_diff>
--- a/AWS/AWS DynamoDB/Notes.docx
+++ b/AWS/AWS DynamoDB/Notes.docx
@@ -1,6 +1,6 @@
 
 <file path=word/document.xml><?xml version="1.0" encoding="utf-8"?>
-<w:document xmlns:wpc="http://schemas.microsoft.com/office/word/2010/wordprocessingCanvas" xmlns:cx="http://schemas.microsoft.com/office/drawing/2014/chartex" xmlns:cx1="http://schemas.microsoft.com/office/drawing/2015/9/8/chartex" xmlns:cx2="http://schemas.microsoft.com/office/drawing/2015/10/21/chartex" xmlns:cx3="http://schemas.microsoft.com/office/drawing/2016/5/9/chartex" xmlns:cx4="http://schemas.microsoft.com/office/drawing/2016/5/10/chartex" xmlns:cx5="http://schemas.microsoft.com/office/drawing/2016/5/11/chartex" xmlns:cx6="http://schemas.microsoft.com/office/drawing/2016/5/12/chartex" xmlns:cx7="http://schemas.microsoft.com/office/drawing/2016/5/13/chartex" xmlns:cx8="http://schemas.microsoft.com/office/drawing/2016/5/14/chartex" xmlns:mc="http://schemas.openxmlformats.org/markup-compatibility/2006" xmlns:aink="http://schemas.microsoft.com/office/drawing/2016/ink" xmlns:am3d="http://schemas.microsoft.com/office/drawing/2017/model3d" xmlns:o="urn:schemas-microsoft-com:office:office" xmlns:oel="http://schemas.microsoft.com/office/2019/extlst" xmlns:r="http://schemas.openxmlformats.org/officeDocument/2006/relationships" xmlns:m="http://schemas.openxmlformats.org/officeDocument/2006/math" xmlns:v="urn:schemas-microsoft-com:vml" xmlns:wp14="http://schemas.microsoft.com/office/word/2010/wordprocessingDrawing" xmlns:wp="http://schemas.openxmlformats.org/drawingml/2006/wordprocessingDrawing" xmlns:w10="urn:schemas-microsoft-com:office:word" xmlns:w="http://schemas.openxmlformats.org/wordprocessingml/2006/main" xmlns:w14="http://schemas.microsoft.com/office/word/2010/wordml" xmlns:w15="http://schemas.microsoft.com/office/word/2012/wordml" xmlns:w16cei="http://schemas.microsoft.com/office/word/2026/wordml/cei" xmlns:w16cex="http://schemas.microsoft.com/office/word/2018/wordml/cex" xmlns:w16cid="http://schemas.microsoft.com/office/word/2016/wordml/cid" xmlns:w16="http://schemas.microsoft.com/office/word/2018/wordml" xmlns:w16du="http://schemas.microsoft.com/office/word/2023/wordml/word16du" xmlns:w16sdtdh="http://schemas.microsoft.com/office/word/2020/wordml/sdtdatahash" xmlns:w16sdtfl="http://schemas.microsoft.com/office/word/2024/wordml/sdtformatlock" xmlns:w16se="http://schemas.microsoft.com/office/word/2015/wordml/symex" xmlns:wpg="http://schemas.microsoft.com/office/word/2010/wordprocessingGroup" xmlns:wpi="http://schemas.microsoft.com/office/word/2010/wordprocessingInk" xmlns:wne="http://schemas.microsoft.com/office/word/2006/wordml" xmlns:wps="http://schemas.microsoft.com/office/word/2010/wordprocessingShape" mc:Ignorable="w14 w15 w16se w16cid w16 w16cex w16sdtdh w16sdtfl w16du wp14">
+<w:document xmlns:wpc="http://schemas.microsoft.com/office/word/2010/wordprocessingCanvas" xmlns:cx="http://schemas.microsoft.com/office/drawing/2014/chartex" xmlns:cx1="http://schemas.microsoft.com/office/drawing/2015/9/8/chartex" xmlns:cx2="http://schemas.microsoft.com/office/drawing/2015/10/21/chartex" xmlns:cx3="http://schemas.microsoft.com/office/drawing/2016/5/9/chartex" xmlns:cx4="http://schemas.microsoft.com/office/drawing/2016/5/10/chartex" xmlns:cx5="http://schemas.microsoft.com/office/drawing/2016/5/11/chartex" xmlns:cx6="http://schemas.microsoft.com/office/drawing/2016/5/12/chartex" xmlns:cx7="http://schemas.microsoft.com/office/drawing/2016/5/13/chartex" xmlns:cx8="http://schemas.microsoft.com/office/drawing/2016/5/14/chartex" xmlns:mc="http://schemas.openxmlformats.org/markup-compatibility/2006" xmlns:aink="http://schemas.microsoft.com/office/drawing/2016/ink" xmlns:am3d="http://schemas.microsoft.com/office/drawing/2017/model3d" xmlns:o="urn:schemas-microsoft-com:office:office" xmlns:oel="http://schemas.microsoft.com/office/2019/extlst" xmlns:r="http://schemas.openxmlformats.org/officeDocument/2006/relationships" xmlns:m="http://schemas.openxmlformats.org/officeDocument/2006/math" xmlns:v="urn:schemas-microsoft-com:vml" xmlns:wp14="http://schemas.microsoft.com/office/word/2010/wordprocessingDrawing" xmlns:wp="http://schemas.openxmlformats.org/drawingml/2006/wordprocessingDrawing" xmlns:w10="urn:schemas-microsoft-com:office:word" xmlns:w="http://schemas.openxmlformats.org/wordprocessingml/2006/main" xmlns:w14="http://schemas.microsoft.com/office/word/2010/wordml" xmlns:w15="http://schemas.microsoft.com/office/word/2012/wordml" xmlns:w16cex="http://schemas.microsoft.com/office/word/2018/wordml/cex" xmlns:w16cid="http://schemas.microsoft.com/office/word/2016/wordml/cid" xmlns:w16="http://schemas.microsoft.com/office/word/2018/wordml" xmlns:w16du="http://schemas.microsoft.com/office/word/2023/wordml/word16du" xmlns:w16sdtdh="http://schemas.microsoft.com/office/word/2020/wordml/sdtdatahash" xmlns:w16sdtfl="http://schemas.microsoft.com/office/word/2024/wordml/sdtformatlock" xmlns:w16se="http://schemas.microsoft.com/office/word/2015/wordml/symex" xmlns:wpg="http://schemas.microsoft.com/office/word/2010/wordprocessingGroup" xmlns:wpi="http://schemas.microsoft.com/office/word/2010/wordprocessingInk" xmlns:wne="http://schemas.microsoft.com/office/word/2006/wordml" xmlns:wps="http://schemas.microsoft.com/office/word/2010/wordprocessingShape" mc:Ignorable="w14 w15 w16se w16cid w16 w16cex w16sdtdh w16sdtfl w16du wp14">
   <w:body>
     <w:p>
       <w:pPr>
@@ -500,19 +500,7 @@
         <w:rPr>
           <w:color w:val="000000" w:themeColor="text1"/>
         </w:rPr>
-        <w:t>)</w:t>
-      </w:r>
-      <w:r>
-        <w:rPr>
-          <w:color w:val="000000" w:themeColor="text1"/>
-        </w:rPr>
-        <w:t xml:space="preserve"> </w:t>
-      </w:r>
-      <w:r>
-        <w:rPr>
-          <w:color w:val="000000" w:themeColor="text1"/>
-        </w:rPr>
-        <w:t xml:space="preserve">For </w:t>
+        <w:t xml:space="preserve">) For </w:t>
       </w:r>
       <w:proofErr w:type="gramStart"/>
       <w:r>
@@ -637,183 +625,7 @@
           <w:lang w:val="en-AU"/>
           <w14:ligatures w14:val="standardContextual"/>
         </w:rPr>
-        <w:t>For example:</w:t>
-      </w:r>
-      <w:r>
-        <w:rPr>
-          <w:rFonts w:asciiTheme="minorHAnsi" w:eastAsiaTheme="minorHAnsi" w:hAnsiTheme="minorHAnsi" w:cstheme="minorBidi"/>
-          <w:color w:val="000000" w:themeColor="text1"/>
-          <w:sz w:val="22"/>
-          <w:szCs w:val="22"/>
-          <w:lang w:val="en-AU"/>
-          <w14:ligatures w14:val="standardContextual"/>
-        </w:rPr>
-        <w:t xml:space="preserve"> </w:t>
-      </w:r>
-      <w:r>
-        <w:rPr>
-          <w:rFonts w:asciiTheme="minorHAnsi" w:eastAsiaTheme="minorHAnsi" w:hAnsiTheme="minorHAnsi" w:cstheme="minorBidi"/>
-          <w:color w:val="000000" w:themeColor="text1"/>
-          <w:sz w:val="22"/>
-          <w:szCs w:val="22"/>
-          <w:lang w:val="en-AU"/>
-          <w14:ligatures w14:val="standardContextual"/>
-        </w:rPr>
-        <w:t>SK = HARVEST#2026-08-17#123</w:t>
-      </w:r>
-      <w:r>
-        <w:rPr>
-          <w:rFonts w:asciiTheme="minorHAnsi" w:eastAsiaTheme="minorHAnsi" w:hAnsiTheme="minorHAnsi" w:cstheme="minorBidi"/>
-          <w:color w:val="000000" w:themeColor="text1"/>
-          <w:sz w:val="22"/>
-          <w:szCs w:val="22"/>
-          <w:lang w:val="en-AU"/>
-          <w14:ligatures w14:val="standardContextual"/>
-        </w:rPr>
-        <w:t xml:space="preserve"> </w:t>
-      </w:r>
-      <w:r>
-        <w:rPr>
-          <w:rFonts w:asciiTheme="minorHAnsi" w:eastAsiaTheme="minorHAnsi" w:hAnsiTheme="minorHAnsi" w:cstheme="minorBidi"/>
-          <w:color w:val="000000" w:themeColor="text1"/>
-          <w:sz w:val="22"/>
-          <w:szCs w:val="22"/>
-          <w:lang w:val="en-AU"/>
-          <w14:ligatures w14:val="standardContextual"/>
-        </w:rPr>
-        <w:t>This contains three pieces of information</w:t>
-      </w:r>
-      <w:r>
-        <w:rPr>
-          <w:rFonts w:asciiTheme="minorHAnsi" w:eastAsiaTheme="minorHAnsi" w:hAnsiTheme="minorHAnsi" w:cstheme="minorBidi"/>
-          <w:color w:val="000000" w:themeColor="text1"/>
-          <w:sz w:val="22"/>
-          <w:szCs w:val="22"/>
-          <w:lang w:val="en-AU"/>
-          <w14:ligatures w14:val="standardContextual"/>
-        </w:rPr>
-        <w:t xml:space="preserve">: </w:t>
-      </w:r>
-      <w:r>
-        <w:rPr>
-          <w:rFonts w:asciiTheme="minorHAnsi" w:eastAsiaTheme="minorHAnsi" w:hAnsiTheme="minorHAnsi" w:cstheme="minorBidi"/>
-          <w:color w:val="000000" w:themeColor="text1"/>
-          <w:sz w:val="22"/>
-          <w:szCs w:val="22"/>
-          <w:lang w:val="en-AU"/>
-          <w14:ligatures w14:val="standardContextual"/>
-        </w:rPr>
-        <w:t>HARVEST</w:t>
-      </w:r>
-      <w:r>
-        <w:rPr>
-          <w:rFonts w:asciiTheme="minorHAnsi" w:eastAsiaTheme="minorHAnsi" w:hAnsiTheme="minorHAnsi" w:cstheme="minorBidi"/>
-          <w:color w:val="000000" w:themeColor="text1"/>
-          <w:sz w:val="22"/>
-          <w:szCs w:val="22"/>
-          <w:lang w:val="en-AU"/>
-          <w14:ligatures w14:val="standardContextual"/>
-        </w:rPr>
-        <w:t xml:space="preserve"> == T</w:t>
-      </w:r>
-      <w:r>
-        <w:rPr>
-          <w:rFonts w:asciiTheme="minorHAnsi" w:eastAsiaTheme="minorHAnsi" w:hAnsiTheme="minorHAnsi" w:cstheme="minorBidi"/>
-          <w:color w:val="000000" w:themeColor="text1"/>
-          <w:sz w:val="22"/>
-          <w:szCs w:val="22"/>
-          <w:lang w:val="en-AU"/>
-          <w14:ligatures w14:val="standardContextual"/>
-        </w:rPr>
-        <w:t>ype</w:t>
-      </w:r>
-      <w:r>
-        <w:rPr>
-          <w:rFonts w:asciiTheme="minorHAnsi" w:eastAsiaTheme="minorHAnsi" w:hAnsiTheme="minorHAnsi" w:cstheme="minorBidi"/>
-          <w:color w:val="000000" w:themeColor="text1"/>
-          <w:sz w:val="22"/>
-          <w:szCs w:val="22"/>
-          <w:lang w:val="en-AU"/>
-          <w14:ligatures w14:val="standardContextual"/>
-        </w:rPr>
-        <w:t xml:space="preserve">, </w:t>
-      </w:r>
-      <w:r>
-        <w:rPr>
-          <w:rFonts w:asciiTheme="minorHAnsi" w:eastAsiaTheme="minorHAnsi" w:hAnsiTheme="minorHAnsi" w:cstheme="minorBidi"/>
-          <w:color w:val="000000" w:themeColor="text1"/>
-          <w:sz w:val="22"/>
-          <w:szCs w:val="22"/>
-          <w:lang w:val="en-AU"/>
-          <w14:ligatures w14:val="standardContextual"/>
-        </w:rPr>
-        <w:t>2026-08-17</w:t>
-      </w:r>
-      <w:r>
-        <w:rPr>
-          <w:rFonts w:asciiTheme="minorHAnsi" w:eastAsiaTheme="minorHAnsi" w:hAnsiTheme="minorHAnsi" w:cstheme="minorBidi"/>
-          <w:color w:val="000000" w:themeColor="text1"/>
-          <w:sz w:val="22"/>
-          <w:szCs w:val="22"/>
-          <w:lang w:val="en-AU"/>
-          <w14:ligatures w14:val="standardContextual"/>
-        </w:rPr>
-        <w:t xml:space="preserve"> == D</w:t>
-      </w:r>
-      <w:r>
-        <w:rPr>
-          <w:rFonts w:asciiTheme="minorHAnsi" w:eastAsiaTheme="minorHAnsi" w:hAnsiTheme="minorHAnsi" w:cstheme="minorBidi"/>
-          <w:color w:val="000000" w:themeColor="text1"/>
-          <w:sz w:val="22"/>
-          <w:szCs w:val="22"/>
-          <w:lang w:val="en-AU"/>
-          <w14:ligatures w14:val="standardContextual"/>
-        </w:rPr>
-        <w:t>ate</w:t>
-      </w:r>
-      <w:r>
-        <w:rPr>
-          <w:rFonts w:asciiTheme="minorHAnsi" w:eastAsiaTheme="minorHAnsi" w:hAnsiTheme="minorHAnsi" w:cstheme="minorBidi"/>
-          <w:color w:val="000000" w:themeColor="text1"/>
-          <w:sz w:val="22"/>
-          <w:szCs w:val="22"/>
-          <w:lang w:val="en-AU"/>
-          <w14:ligatures w14:val="standardContextual"/>
-        </w:rPr>
-        <w:t xml:space="preserve">, </w:t>
-      </w:r>
-      <w:r>
-        <w:rPr>
-          <w:rFonts w:asciiTheme="minorHAnsi" w:eastAsiaTheme="minorHAnsi" w:hAnsiTheme="minorHAnsi" w:cstheme="minorBidi"/>
-          <w:color w:val="000000" w:themeColor="text1"/>
-          <w:sz w:val="22"/>
-          <w:szCs w:val="22"/>
-          <w:lang w:val="en-AU"/>
-          <w14:ligatures w14:val="standardContextual"/>
-        </w:rPr>
-        <w:t>123</w:t>
-      </w:r>
-      <w:r>
-        <w:rPr>
-          <w:rFonts w:asciiTheme="minorHAnsi" w:eastAsiaTheme="minorHAnsi" w:hAnsiTheme="minorHAnsi" w:cstheme="minorBidi"/>
-          <w:color w:val="000000" w:themeColor="text1"/>
-          <w:sz w:val="22"/>
-          <w:szCs w:val="22"/>
-          <w:lang w:val="en-AU"/>
-          <w14:ligatures w14:val="standardContextual"/>
-        </w:rPr>
-        <w:t xml:space="preserve"> == </w:t>
-      </w:r>
-      <w:r>
-        <w:rPr>
-          <w:rFonts w:asciiTheme="minorHAnsi" w:eastAsiaTheme="minorHAnsi" w:hAnsiTheme="minorHAnsi" w:cstheme="minorBidi"/>
-          <w:color w:val="000000" w:themeColor="text1"/>
-          <w:sz w:val="22"/>
-          <w:szCs w:val="22"/>
-          <w:lang w:val="en-AU"/>
-          <w14:ligatures w14:val="standardContextual"/>
-        </w:rPr>
-        <w:t>unique ID</w:t>
+        <w:t>For example: SK = HARVEST#2026-08-17#123 This contains three pieces of information: HARVEST == Type, 2026-08-17 == Date, 123 == unique ID</w:t>
       </w:r>
     </w:p>
     <w:p>
@@ -1100,29 +912,7 @@
           <w:lang w:val="en-AU"/>
           <w14:ligatures w14:val="standardContextual"/>
         </w:rPr>
-        <w:t xml:space="preserve"> asks DynamoDB:</w:t>
-      </w:r>
-      <w:r>
-        <w:rPr>
-          <w:rFonts w:asciiTheme="minorHAnsi" w:eastAsiaTheme="minorHAnsi" w:hAnsiTheme="minorHAnsi" w:cstheme="minorBidi"/>
-          <w:color w:val="000000" w:themeColor="text1"/>
-          <w:sz w:val="22"/>
-          <w:szCs w:val="22"/>
-          <w:lang w:val="en-AU"/>
-          <w14:ligatures w14:val="standardContextual"/>
-        </w:rPr>
-        <w:t xml:space="preserve"> </w:t>
-      </w:r>
-      <w:r>
-        <w:rPr>
-          <w:rFonts w:asciiTheme="minorHAnsi" w:eastAsiaTheme="minorHAnsi" w:hAnsiTheme="minorHAnsi" w:cstheme="minorBidi"/>
-          <w:color w:val="000000" w:themeColor="text1"/>
-          <w:sz w:val="22"/>
-          <w:szCs w:val="22"/>
-          <w:lang w:val="en-AU"/>
-          <w14:ligatures w14:val="standardContextual"/>
-        </w:rPr>
-        <w:t>"Go through the table and examine the items."</w:t>
+        <w:t xml:space="preserve"> asks DynamoDB: "Go through the table and examine the items."</w:t>
       </w:r>
       <w:r>
         <w:rPr>
@@ -1163,19 +953,7 @@
         <w:rPr>
           <w:color w:val="000000" w:themeColor="text1"/>
         </w:rPr>
-        <w:t>You tell the librarian:</w:t>
-      </w:r>
-      <w:r>
-        <w:rPr>
-          <w:color w:val="000000" w:themeColor="text1"/>
-        </w:rPr>
-        <w:t xml:space="preserve"> </w:t>
-      </w:r>
-      <w:r>
-        <w:rPr>
-          <w:color w:val="000000" w:themeColor="text1"/>
-        </w:rPr>
-        <w:t>"Go to shelf CUSTOMER#123 and give me the orders."</w:t>
+        <w:t>You tell the librarian: "Go to shelf CUSTOMER#123 and give me the orders."</w:t>
       </w:r>
     </w:p>
     <w:p>
@@ -1206,19 +984,7 @@
         <w:rPr>
           <w:color w:val="000000" w:themeColor="text1"/>
         </w:rPr>
-        <w:t>You tell the librarian:</w:t>
-      </w:r>
-      <w:r>
-        <w:rPr>
-          <w:color w:val="000000" w:themeColor="text1"/>
-        </w:rPr>
-        <w:t xml:space="preserve"> </w:t>
-      </w:r>
-      <w:r>
-        <w:rPr>
-          <w:color w:val="000000" w:themeColor="text1"/>
-        </w:rPr>
-        <w:t>"Look through the entire library and find every book about customers."</w:t>
+        <w:t>You tell the librarian: "Look through the entire library and find every book about customers."</w:t>
       </w:r>
     </w:p>
     <w:p>
@@ -2110,18 +1876,7 @@
           <w:lang w:val="en-AU"/>
           <w14:ligatures w14:val="standardContextual"/>
         </w:rPr>
-        <w:t xml:space="preserve"> key starts with this value."</w:t>
-      </w:r>
-      <w:r>
-        <w:rPr>
-          <w:rFonts w:asciiTheme="minorHAnsi" w:eastAsiaTheme="minorHAnsi" w:hAnsiTheme="minorHAnsi" w:cstheme="minorBidi"/>
-          <w:color w:val="000000" w:themeColor="text1"/>
-          <w:sz w:val="22"/>
-          <w:szCs w:val="22"/>
-          <w:lang w:val="en-AU"/>
-          <w14:ligatures w14:val="standardContextual"/>
-        </w:rPr>
-        <w:t xml:space="preserve"> </w:t>
+        <w:t xml:space="preserve"> key starts with this value." </w:t>
       </w:r>
     </w:p>
     <w:p>
@@ -2844,29 +2599,7 @@
           <w:lang w:val="en-AU"/>
           <w14:ligatures w14:val="standardContextual"/>
         </w:rPr>
-        <w:t>T</w:t>
-      </w:r>
-      <w:r>
-        <w:rPr>
-          <w:rFonts w:asciiTheme="minorHAnsi" w:eastAsiaTheme="minorHAnsi" w:hAnsiTheme="minorHAnsi" w:cstheme="minorBidi"/>
-          <w:color w:val="000000" w:themeColor="text1"/>
-          <w:sz w:val="22"/>
-          <w:szCs w:val="22"/>
-          <w:lang w:val="en-AU"/>
-          <w14:ligatures w14:val="standardContextual"/>
-        </w:rPr>
-        <w:t>hink of DynamoDB capacity as answering one simple question:</w:t>
-      </w:r>
-      <w:r>
-        <w:rPr>
-          <w:rFonts w:asciiTheme="minorHAnsi" w:eastAsiaTheme="minorHAnsi" w:hAnsiTheme="minorHAnsi" w:cstheme="minorBidi"/>
-          <w:color w:val="000000" w:themeColor="text1"/>
-          <w:sz w:val="22"/>
-          <w:szCs w:val="22"/>
-          <w:lang w:val="en-AU"/>
-          <w14:ligatures w14:val="standardContextual"/>
-        </w:rPr>
-        <w:t xml:space="preserve"> “How much work can my DynamoDB table handle, and how much will that work cost?”</w:t>
+        <w:t>Think of DynamoDB capacity as answering one simple question: “How much work can my DynamoDB table handle, and how much will that work cost?”</w:t>
       </w:r>
     </w:p>
     <w:p>
@@ -4508,51 +4241,7 @@
           <w:lang w:val="en-AU"/>
           <w14:ligatures w14:val="standardContextual"/>
         </w:rPr>
-        <w:t>A conditional write says: “DynamoDB, only perform this write if this condition is true.”</w:t>
-      </w:r>
-      <w:r>
-        <w:rPr>
-          <w:rFonts w:asciiTheme="minorHAnsi" w:eastAsiaTheme="minorHAnsi" w:hAnsiTheme="minorHAnsi" w:cstheme="minorBidi"/>
-          <w:color w:val="000000" w:themeColor="text1"/>
-          <w:sz w:val="22"/>
-          <w:szCs w:val="22"/>
-          <w:lang w:val="en-AU"/>
-          <w14:ligatures w14:val="standardContextual"/>
-        </w:rPr>
-        <w:t xml:space="preserve">  </w:t>
-      </w:r>
-      <w:r>
-        <w:rPr>
-          <w:rFonts w:asciiTheme="minorHAnsi" w:eastAsiaTheme="minorHAnsi" w:hAnsiTheme="minorHAnsi" w:cstheme="minorBidi"/>
-          <w:color w:val="000000" w:themeColor="text1"/>
-          <w:sz w:val="22"/>
-          <w:szCs w:val="22"/>
-          <w:lang w:val="en-AU"/>
-          <w14:ligatures w14:val="standardContextual"/>
-        </w:rPr>
-        <w:t xml:space="preserve">The important part is that </w:t>
-      </w:r>
-      <w:r>
-        <w:rPr>
-          <w:rFonts w:asciiTheme="minorHAnsi" w:eastAsiaTheme="minorHAnsi" w:hAnsiTheme="minorHAnsi" w:cstheme="minorBidi"/>
-          <w:color w:val="000000" w:themeColor="text1"/>
-          <w:sz w:val="22"/>
-          <w:szCs w:val="22"/>
-          <w:lang w:val="en-AU"/>
-          <w14:ligatures w14:val="standardContextual"/>
-        </w:rPr>
-        <w:t>DynamoDB checks the condition for you</w:t>
-      </w:r>
-      <w:r>
-        <w:rPr>
-          <w:rFonts w:asciiTheme="minorHAnsi" w:eastAsiaTheme="minorHAnsi" w:hAnsiTheme="minorHAnsi" w:cstheme="minorBidi"/>
-          <w:color w:val="000000" w:themeColor="text1"/>
-          <w:sz w:val="22"/>
-          <w:szCs w:val="22"/>
-          <w:lang w:val="en-AU"/>
-          <w14:ligatures w14:val="standardContextual"/>
-        </w:rPr>
-        <w:t>.</w:t>
+        <w:t>A conditional write says: “DynamoDB, only perform this write if this condition is true.”  The important part is that DynamoDB checks the condition for you.</w:t>
       </w:r>
     </w:p>
     <w:p>
@@ -7324,6 +7013,482 @@
         <w:t>}));</w:t>
       </w:r>
     </w:p>
+    <w:p>
+      <w:pPr>
+        <w:rPr>
+          <w:color w:val="000000" w:themeColor="text1"/>
+          <w:lang w:val="en-US"/>
+        </w:rPr>
+      </w:pPr>
+    </w:p>
+    <w:p>
+      <w:pPr>
+        <w:rPr>
+          <w:b/>
+          <w:bCs/>
+          <w:color w:val="000000" w:themeColor="text1"/>
+          <w:sz w:val="28"/>
+          <w:szCs w:val="28"/>
+          <w:u w:val="single"/>
+        </w:rPr>
+      </w:pPr>
+      <w:r>
+        <w:rPr>
+          <w:b/>
+          <w:bCs/>
+          <w:color w:val="000000" w:themeColor="text1"/>
+          <w:sz w:val="28"/>
+          <w:szCs w:val="28"/>
+          <w:u w:val="single"/>
+        </w:rPr>
+        <w:t>General Q&amp;A for DynamoDB:</w:t>
+      </w:r>
+    </w:p>
+    <w:p>
+      <w:pPr>
+        <w:rPr>
+          <w:color w:val="000000" w:themeColor="text1"/>
+          <w:lang w:val="en-US"/>
+        </w:rPr>
+      </w:pPr>
+      <w:r>
+        <w:rPr>
+          <w:b/>
+          <w:bCs/>
+          <w:color w:val="000000" w:themeColor="text1"/>
+          <w:lang w:val="en-US"/>
+        </w:rPr>
+        <w:t>Single-table design is better when:</w:t>
+      </w:r>
+    </w:p>
+    <w:p>
+      <w:pPr>
+        <w:pStyle w:val="ListParagraph"/>
+        <w:numPr>
+          <w:ilvl w:val="0"/>
+          <w:numId w:val="24"/>
+        </w:numPr>
+        <w:rPr>
+          <w:color w:val="000000" w:themeColor="text1"/>
+          <w:lang w:val="en-US"/>
+        </w:rPr>
+      </w:pPr>
+      <w:r>
+        <w:rPr>
+          <w:color w:val="000000" w:themeColor="text1"/>
+          <w:lang w:val="en-US"/>
+        </w:rPr>
+        <w:t xml:space="preserve">You have related entities accessed together. </w:t>
+      </w:r>
+    </w:p>
+    <w:p>
+      <w:pPr>
+        <w:pStyle w:val="ListParagraph"/>
+        <w:numPr>
+          <w:ilvl w:val="0"/>
+          <w:numId w:val="24"/>
+        </w:numPr>
+        <w:rPr>
+          <w:color w:val="000000" w:themeColor="text1"/>
+          <w:lang w:val="en-US"/>
+        </w:rPr>
+      </w:pPr>
+      <w:r>
+        <w:rPr>
+          <w:color w:val="000000" w:themeColor="text1"/>
+          <w:lang w:val="en-US"/>
+        </w:rPr>
+        <w:t xml:space="preserve">Access patterns are known and stable. </w:t>
+      </w:r>
+    </w:p>
+    <w:p>
+      <w:pPr>
+        <w:pStyle w:val="ListParagraph"/>
+        <w:numPr>
+          <w:ilvl w:val="0"/>
+          <w:numId w:val="24"/>
+        </w:numPr>
+        <w:rPr>
+          <w:color w:val="000000" w:themeColor="text1"/>
+          <w:lang w:val="en-US"/>
+        </w:rPr>
+      </w:pPr>
+      <w:r>
+        <w:rPr>
+          <w:color w:val="000000" w:themeColor="text1"/>
+          <w:lang w:val="en-US"/>
+        </w:rPr>
+        <w:t xml:space="preserve">You want fewer </w:t>
+      </w:r>
+      <w:proofErr w:type="gramStart"/>
+      <w:r>
+        <w:rPr>
+          <w:color w:val="000000" w:themeColor="text1"/>
+          <w:lang w:val="en-US"/>
+        </w:rPr>
+        <w:t>queries</w:t>
+      </w:r>
+      <w:proofErr w:type="gramEnd"/>
+      <w:r>
+        <w:rPr>
+          <w:color w:val="000000" w:themeColor="text1"/>
+          <w:lang w:val="en-US"/>
+        </w:rPr>
+        <w:t xml:space="preserve">/round trips. </w:t>
+      </w:r>
+    </w:p>
+    <w:p>
+      <w:pPr>
+        <w:pStyle w:val="ListParagraph"/>
+        <w:numPr>
+          <w:ilvl w:val="0"/>
+          <w:numId w:val="24"/>
+        </w:numPr>
+        <w:rPr>
+          <w:color w:val="000000" w:themeColor="text1"/>
+          <w:lang w:val="en-US"/>
+        </w:rPr>
+      </w:pPr>
+      <w:r>
+        <w:rPr>
+          <w:color w:val="000000" w:themeColor="text1"/>
+          <w:lang w:val="en-US"/>
+        </w:rPr>
+        <w:t xml:space="preserve">You need efficient joins-like access via composite keys. </w:t>
+      </w:r>
+    </w:p>
+    <w:p>
+      <w:pPr>
+        <w:pStyle w:val="ListParagraph"/>
+        <w:numPr>
+          <w:ilvl w:val="0"/>
+          <w:numId w:val="24"/>
+        </w:numPr>
+        <w:rPr>
+          <w:color w:val="000000" w:themeColor="text1"/>
+          <w:lang w:val="en-US"/>
+        </w:rPr>
+      </w:pPr>
+      <w:r>
+        <w:rPr>
+          <w:color w:val="000000" w:themeColor="text1"/>
+          <w:lang w:val="en-US"/>
+        </w:rPr>
+        <w:t xml:space="preserve">You have high-scale workloads where denormalization helps. </w:t>
+      </w:r>
+    </w:p>
+    <w:p>
+      <w:pPr>
+        <w:rPr>
+          <w:b/>
+          <w:bCs/>
+          <w:color w:val="000000" w:themeColor="text1"/>
+          <w:lang w:val="en-US"/>
+        </w:rPr>
+      </w:pPr>
+    </w:p>
+    <w:p>
+      <w:pPr>
+        <w:rPr>
+          <w:color w:val="000000" w:themeColor="text1"/>
+          <w:lang w:val="en-US"/>
+        </w:rPr>
+      </w:pPr>
+      <w:r>
+        <w:rPr>
+          <w:b/>
+          <w:bCs/>
+          <w:color w:val="000000" w:themeColor="text1"/>
+          <w:lang w:val="en-US"/>
+        </w:rPr>
+        <w:t>Multi-table design is better when:</w:t>
+      </w:r>
+    </w:p>
+    <w:p>
+      <w:pPr>
+        <w:pStyle w:val="ListParagraph"/>
+        <w:numPr>
+          <w:ilvl w:val="0"/>
+          <w:numId w:val="25"/>
+        </w:numPr>
+        <w:rPr>
+          <w:color w:val="000000" w:themeColor="text1"/>
+          <w:lang w:val="en-US"/>
+        </w:rPr>
+      </w:pPr>
+      <w:r>
+        <w:rPr>
+          <w:color w:val="000000" w:themeColor="text1"/>
+          <w:lang w:val="en-US"/>
+        </w:rPr>
+        <w:t xml:space="preserve">Entities are mostly independent. </w:t>
+      </w:r>
+    </w:p>
+    <w:p>
+      <w:pPr>
+        <w:pStyle w:val="ListParagraph"/>
+        <w:numPr>
+          <w:ilvl w:val="0"/>
+          <w:numId w:val="25"/>
+        </w:numPr>
+        <w:rPr>
+          <w:color w:val="000000" w:themeColor="text1"/>
+          <w:lang w:val="en-US"/>
+        </w:rPr>
+      </w:pPr>
+      <w:r>
+        <w:rPr>
+          <w:color w:val="000000" w:themeColor="text1"/>
+          <w:lang w:val="en-US"/>
+        </w:rPr>
+        <w:t xml:space="preserve">Access patterns differ significantly. </w:t>
+      </w:r>
+    </w:p>
+    <w:p>
+      <w:pPr>
+        <w:pStyle w:val="ListParagraph"/>
+        <w:numPr>
+          <w:ilvl w:val="0"/>
+          <w:numId w:val="25"/>
+        </w:numPr>
+        <w:rPr>
+          <w:color w:val="000000" w:themeColor="text1"/>
+          <w:lang w:val="en-US"/>
+        </w:rPr>
+      </w:pPr>
+      <w:r>
+        <w:rPr>
+          <w:color w:val="000000" w:themeColor="text1"/>
+          <w:lang w:val="en-US"/>
+        </w:rPr>
+        <w:t xml:space="preserve">Different entities have very different scaling/throughput needs. </w:t>
+      </w:r>
+    </w:p>
+    <w:p>
+      <w:pPr>
+        <w:pStyle w:val="ListParagraph"/>
+        <w:numPr>
+          <w:ilvl w:val="0"/>
+          <w:numId w:val="25"/>
+        </w:numPr>
+        <w:rPr>
+          <w:color w:val="000000" w:themeColor="text1"/>
+          <w:lang w:val="en-US"/>
+        </w:rPr>
+      </w:pPr>
+      <w:r>
+        <w:rPr>
+          <w:color w:val="000000" w:themeColor="text1"/>
+          <w:lang w:val="en-US"/>
+        </w:rPr>
+        <w:t xml:space="preserve">You need simpler schemas and operations. </w:t>
+      </w:r>
+    </w:p>
+    <w:p>
+      <w:pPr>
+        <w:pStyle w:val="ListParagraph"/>
+        <w:numPr>
+          <w:ilvl w:val="0"/>
+          <w:numId w:val="25"/>
+        </w:numPr>
+        <w:rPr>
+          <w:color w:val="000000" w:themeColor="text1"/>
+          <w:lang w:val="en-US"/>
+        </w:rPr>
+      </w:pPr>
+      <w:r>
+        <w:rPr>
+          <w:color w:val="000000" w:themeColor="text1"/>
+          <w:lang w:val="en-US"/>
+        </w:rPr>
+        <w:t>Data has different lifecycle/retention/security requirements.</w:t>
+      </w:r>
+    </w:p>
+    <w:p>
+      <w:pPr>
+        <w:rPr>
+          <w:b/>
+          <w:bCs/>
+          <w:color w:val="000000" w:themeColor="text1"/>
+          <w:lang w:val="en-US"/>
+        </w:rPr>
+      </w:pPr>
+    </w:p>
+    <w:p>
+      <w:pPr>
+        <w:rPr>
+          <w:color w:val="000000" w:themeColor="text1"/>
+          <w:lang w:val="en-US"/>
+        </w:rPr>
+      </w:pPr>
+      <w:r>
+        <w:rPr>
+          <w:b/>
+          <w:bCs/>
+          <w:color w:val="000000" w:themeColor="text1"/>
+          <w:lang w:val="en-US"/>
+        </w:rPr>
+        <w:t>Use a GSI when:</w:t>
+      </w:r>
+    </w:p>
+    <w:p>
+      <w:pPr>
+        <w:numPr>
+          <w:ilvl w:val="0"/>
+          <w:numId w:val="26"/>
+        </w:numPr>
+        <w:rPr>
+          <w:color w:val="000000" w:themeColor="text1"/>
+          <w:lang w:val="en-US"/>
+        </w:rPr>
+      </w:pPr>
+      <w:r>
+        <w:rPr>
+          <w:color w:val="000000" w:themeColor="text1"/>
+          <w:lang w:val="en-US"/>
+        </w:rPr>
+        <w:t xml:space="preserve">You need another way to query the same data. </w:t>
+      </w:r>
+    </w:p>
+    <w:p>
+      <w:pPr>
+        <w:numPr>
+          <w:ilvl w:val="0"/>
+          <w:numId w:val="26"/>
+        </w:numPr>
+        <w:rPr>
+          <w:color w:val="000000" w:themeColor="text1"/>
+          <w:lang w:val="en-US"/>
+        </w:rPr>
+      </w:pPr>
+      <w:r>
+        <w:rPr>
+          <w:color w:val="000000" w:themeColor="text1"/>
+          <w:lang w:val="en-US"/>
+        </w:rPr>
+        <w:t xml:space="preserve">You want DynamoDB to maintain it automatically. </w:t>
+      </w:r>
+    </w:p>
+    <w:p>
+      <w:pPr>
+        <w:numPr>
+          <w:ilvl w:val="0"/>
+          <w:numId w:val="26"/>
+        </w:numPr>
+        <w:rPr>
+          <w:color w:val="000000" w:themeColor="text1"/>
+          <w:lang w:val="en-US"/>
+        </w:rPr>
+      </w:pPr>
+      <w:r>
+        <w:rPr>
+          <w:color w:val="000000" w:themeColor="text1"/>
+          <w:lang w:val="en-US"/>
+        </w:rPr>
+        <w:t xml:space="preserve">The access pattern is closely related to the base table. </w:t>
+      </w:r>
+    </w:p>
+    <w:p>
+      <w:pPr>
+        <w:rPr>
+          <w:color w:val="000000" w:themeColor="text1"/>
+          <w:lang w:val="en-US"/>
+        </w:rPr>
+      </w:pPr>
+      <w:r>
+        <w:rPr>
+          <w:b/>
+          <w:bCs/>
+          <w:color w:val="000000" w:themeColor="text1"/>
+          <w:lang w:val="en-US"/>
+        </w:rPr>
+        <w:t>Use a new table when:</w:t>
+      </w:r>
+    </w:p>
+    <w:p>
+      <w:pPr>
+        <w:numPr>
+          <w:ilvl w:val="0"/>
+          <w:numId w:val="27"/>
+        </w:numPr>
+        <w:rPr>
+          <w:color w:val="000000" w:themeColor="text1"/>
+          <w:lang w:val="en-US"/>
+        </w:rPr>
+      </w:pPr>
+      <w:r>
+        <w:rPr>
+          <w:color w:val="000000" w:themeColor="text1"/>
+          <w:lang w:val="en-US"/>
+        </w:rPr>
+        <w:t xml:space="preserve">The data has a different purpose/lifecycle. </w:t>
+      </w:r>
+    </w:p>
+    <w:p>
+      <w:pPr>
+        <w:numPr>
+          <w:ilvl w:val="0"/>
+          <w:numId w:val="27"/>
+        </w:numPr>
+        <w:rPr>
+          <w:color w:val="000000" w:themeColor="text1"/>
+          <w:lang w:val="en-US"/>
+        </w:rPr>
+      </w:pPr>
+      <w:r>
+        <w:rPr>
+          <w:color w:val="000000" w:themeColor="text1"/>
+          <w:lang w:val="en-US"/>
+        </w:rPr>
+        <w:t xml:space="preserve">It needs different scaling or permissions. </w:t>
+      </w:r>
+    </w:p>
+    <w:p>
+      <w:pPr>
+        <w:numPr>
+          <w:ilvl w:val="0"/>
+          <w:numId w:val="27"/>
+        </w:numPr>
+        <w:rPr>
+          <w:color w:val="000000" w:themeColor="text1"/>
+          <w:lang w:val="en-US"/>
+        </w:rPr>
+      </w:pPr>
+      <w:r>
+        <w:rPr>
+          <w:color w:val="000000" w:themeColor="text1"/>
+          <w:lang w:val="en-US"/>
+        </w:rPr>
+        <w:t xml:space="preserve">You want a significantly different data model. </w:t>
+      </w:r>
+    </w:p>
+    <w:p>
+      <w:pPr>
+        <w:numPr>
+          <w:ilvl w:val="0"/>
+          <w:numId w:val="27"/>
+        </w:numPr>
+        <w:rPr>
+          <w:color w:val="000000" w:themeColor="text1"/>
+          <w:lang w:val="en-US"/>
+        </w:rPr>
+      </w:pPr>
+      <w:r>
+        <w:rPr>
+          <w:color w:val="000000" w:themeColor="text1"/>
+          <w:lang w:val="en-US"/>
+        </w:rPr>
+        <w:t>You don't want the GSI's write/storage costs.</w:t>
+      </w:r>
+    </w:p>
+    <w:p>
+      <w:pPr>
+        <w:rPr>
+          <w:color w:val="000000" w:themeColor="text1"/>
+          <w:lang w:val="en-US"/>
+        </w:rPr>
+      </w:pPr>
+    </w:p>
     <w:sectPr>
       <w:pgSz w:w="11906" w:h="16838"/>
       <w:pgMar w:top="1417" w:right="1417" w:bottom="1134" w:left="1417" w:header="720" w:footer="720" w:gutter="0"/>
@@ -7335,7 +7500,7 @@
 </file>
 
 <file path=word/numbering.xml><?xml version="1.0" encoding="utf-8"?>
-<w:numbering xmlns:wpc="http://schemas.microsoft.com/office/word/2010/wordprocessingCanvas" xmlns:cx="http://schemas.microsoft.com/office/drawing/2014/chartex" xmlns:cx1="http://schemas.microsoft.com/office/drawing/2015/9/8/chartex" xmlns:cx2="http://schemas.microsoft.com/office/drawing/2015/10/21/chartex" xmlns:cx3="http://schemas.microsoft.com/office/drawing/2016/5/9/chartex" xmlns:cx4="http://schemas.microsoft.com/office/drawing/2016/5/10/chartex" xmlns:cx5="http://schemas.microsoft.com/office/drawing/2016/5/11/chartex" xmlns:cx6="http://schemas.microsoft.com/office/drawing/2016/5/12/chartex" xmlns:cx7="http://schemas.microsoft.com/office/drawing/2016/5/13/chartex" xmlns:cx8="http://schemas.microsoft.com/office/drawing/2016/5/14/chartex" xmlns:mc="http://schemas.openxmlformats.org/markup-compatibility/2006" xmlns:aink="http://schemas.microsoft.com/office/drawing/2016/ink" xmlns:am3d="http://schemas.microsoft.com/office/drawing/2017/model3d" xmlns:o="urn:schemas-microsoft-com:office:office" xmlns:oel="http://schemas.microsoft.com/office/2019/extlst" xmlns:r="http://schemas.openxmlformats.org/officeDocument/2006/relationships" xmlns:m="http://schemas.openxmlformats.org/officeDocument/2006/math" xmlns:v="urn:schemas-microsoft-com:vml" xmlns:wp14="http://schemas.microsoft.com/office/word/2010/wordprocessingDrawing" xmlns:wp="http://schemas.openxmlformats.org/drawingml/2006/wordprocessingDrawing" xmlns:w10="urn:schemas-microsoft-com:office:word" xmlns:w="http://schemas.openxmlformats.org/wordprocessingml/2006/main" xmlns:w14="http://schemas.microsoft.com/office/word/2010/wordml" xmlns:w15="http://schemas.microsoft.com/office/word/2012/wordml" xmlns:w16cei="http://schemas.microsoft.com/office/word/2026/wordml/cei" xmlns:w16cex="http://schemas.microsoft.com/office/word/2018/wordml/cex" xmlns:w16cid="http://schemas.microsoft.com/office/word/2016/wordml/cid" xmlns:w16="http://schemas.microsoft.com/office/word/2018/wordml" xmlns:w16du="http://schemas.microsoft.com/office/word/2023/wordml/word16du" xmlns:w16sdtdh="http://schemas.microsoft.com/office/word/2020/wordml/sdtdatahash" xmlns:w16sdtfl="http://schemas.microsoft.com/office/word/2024/wordml/sdtformatlock" xmlns:w16se="http://schemas.microsoft.com/office/word/2015/wordml/symex" xmlns:wpg="http://schemas.microsoft.com/office/word/2010/wordprocessingGroup" xmlns:wpi="http://schemas.microsoft.com/office/word/2010/wordprocessingInk" xmlns:wne="http://schemas.microsoft.com/office/word/2006/wordml" xmlns:wps="http://schemas.microsoft.com/office/word/2010/wordprocessingShape" mc:Ignorable="w14 w15 w16se w16cid w16 w16cex w16sdtdh w16sdtfl w16du wp14">
+<w:numbering xmlns:wpc="http://schemas.microsoft.com/office/word/2010/wordprocessingCanvas" xmlns:cx="http://schemas.microsoft.com/office/drawing/2014/chartex" xmlns:cx1="http://schemas.microsoft.com/office/drawing/2015/9/8/chartex" xmlns:cx2="http://schemas.microsoft.com/office/drawing/2015/10/21/chartex" xmlns:cx3="http://schemas.microsoft.com/office/drawing/2016/5/9/chartex" xmlns:cx4="http://schemas.microsoft.com/office/drawing/2016/5/10/chartex" xmlns:cx5="http://schemas.microsoft.com/office/drawing/2016/5/11/chartex" xmlns:cx6="http://schemas.microsoft.com/office/drawing/2016/5/12/chartex" xmlns:cx7="http://schemas.microsoft.com/office/drawing/2016/5/13/chartex" xmlns:cx8="http://schemas.microsoft.com/office/drawing/2016/5/14/chartex" xmlns:mc="http://schemas.openxmlformats.org/markup-compatibility/2006" xmlns:aink="http://schemas.microsoft.com/office/drawing/2016/ink" xmlns:am3d="http://schemas.microsoft.com/office/drawing/2017/model3d" xmlns:o="urn:schemas-microsoft-com:office:office" xmlns:oel="http://schemas.microsoft.com/office/2019/extlst" xmlns:r="http://schemas.openxmlformats.org/officeDocument/2006/relationships" xmlns:m="http://schemas.openxmlformats.org/officeDocument/2006/math" xmlns:v="urn:schemas-microsoft-com:vml" xmlns:wp14="http://schemas.microsoft.com/office/word/2010/wordprocessingDrawing" xmlns:wp="http://schemas.openxmlformats.org/drawingml/2006/wordprocessingDrawing" xmlns:w10="urn:schemas-microsoft-com:office:word" xmlns:w="http://schemas.openxmlformats.org/wordprocessingml/2006/main" xmlns:w14="http://schemas.microsoft.com/office/word/2010/wordml" xmlns:w15="http://schemas.microsoft.com/office/word/2012/wordml" xmlns:w16cex="http://schemas.microsoft.com/office/word/2018/wordml/cex" xmlns:w16cid="http://schemas.microsoft.com/office/word/2016/wordml/cid" xmlns:w16="http://schemas.microsoft.com/office/word/2018/wordml" xmlns:w16du="http://schemas.microsoft.com/office/word/2023/wordml/word16du" xmlns:w16sdtdh="http://schemas.microsoft.com/office/word/2020/wordml/sdtdatahash" xmlns:w16sdtfl="http://schemas.microsoft.com/office/word/2024/wordml/sdtformatlock" xmlns:w16se="http://schemas.microsoft.com/office/word/2015/wordml/symex" xmlns:wpg="http://schemas.microsoft.com/office/word/2010/wordprocessingGroup" xmlns:wpi="http://schemas.microsoft.com/office/word/2010/wordprocessingInk" xmlns:wne="http://schemas.microsoft.com/office/word/2006/wordml" xmlns:wps="http://schemas.microsoft.com/office/word/2010/wordprocessingShape" mc:Ignorable="w14 w15 w16se w16cid w16 w16cex w16sdtdh w16sdtfl w16du wp14">
   <w:abstractNum w:abstractNumId="0" w15:restartNumberingAfterBreak="0">
     <w:nsid w:val="1661326F"/>
     <w:multiLevelType w:val="hybridMultilevel"/>
@@ -8390,6 +8555,155 @@
     </w:lvl>
   </w:abstractNum>
   <w:abstractNum w:abstractNumId="9" w15:restartNumberingAfterBreak="0">
+    <w:nsid w:val="3BAB58FB"/>
+    <w:multiLevelType w:val="multilevel"/>
+    <w:tmpl w:val="D98A2596"/>
+    <w:lvl w:ilvl="0">
+      <w:start w:val="1"/>
+      <w:numFmt w:val="bullet"/>
+      <w:lvlText w:val=""/>
+      <w:lvlJc w:val="left"/>
+      <w:pPr>
+        <w:tabs>
+          <w:tab w:val="num" w:pos="720"/>
+        </w:tabs>
+        <w:ind w:left="720" w:hanging="360"/>
+      </w:pPr>
+      <w:rPr>
+        <w:rFonts w:ascii="Symbol" w:hAnsi="Symbol" w:hint="default"/>
+        <w:sz w:val="20"/>
+      </w:rPr>
+    </w:lvl>
+    <w:lvl w:ilvl="1" w:tentative="1">
+      <w:start w:val="1"/>
+      <w:numFmt w:val="bullet"/>
+      <w:lvlText w:val="o"/>
+      <w:lvlJc w:val="left"/>
+      <w:pPr>
+        <w:tabs>
+          <w:tab w:val="num" w:pos="1440"/>
+        </w:tabs>
+        <w:ind w:left="1440" w:hanging="360"/>
+      </w:pPr>
+      <w:rPr>
+        <w:rFonts w:ascii="Courier New" w:hAnsi="Courier New" w:hint="default"/>
+        <w:sz w:val="20"/>
+      </w:rPr>
+    </w:lvl>
+    <w:lvl w:ilvl="2" w:tentative="1">
+      <w:start w:val="1"/>
+      <w:numFmt w:val="bullet"/>
+      <w:lvlText w:val=""/>
+      <w:lvlJc w:val="left"/>
+      <w:pPr>
+        <w:tabs>
+          <w:tab w:val="num" w:pos="2160"/>
+        </w:tabs>
+        <w:ind w:left="2160" w:hanging="360"/>
+      </w:pPr>
+      <w:rPr>
+        <w:rFonts w:ascii="Wingdings" w:hAnsi="Wingdings" w:hint="default"/>
+        <w:sz w:val="20"/>
+      </w:rPr>
+    </w:lvl>
+    <w:lvl w:ilvl="3" w:tentative="1">
+      <w:start w:val="1"/>
+      <w:numFmt w:val="bullet"/>
+      <w:lvlText w:val=""/>
+      <w:lvlJc w:val="left"/>
+      <w:pPr>
+        <w:tabs>
+          <w:tab w:val="num" w:pos="2880"/>
+        </w:tabs>
+        <w:ind w:left="2880" w:hanging="360"/>
+      </w:pPr>
+      <w:rPr>
+        <w:rFonts w:ascii="Wingdings" w:hAnsi="Wingdings" w:hint="default"/>
+        <w:sz w:val="20"/>
+      </w:rPr>
+    </w:lvl>
+    <w:lvl w:ilvl="4" w:tentative="1">
+      <w:start w:val="1"/>
+      <w:numFmt w:val="bullet"/>
+      <w:lvlText w:val=""/>
+      <w:lvlJc w:val="left"/>
+      <w:pPr>
+        <w:tabs>
+          <w:tab w:val="num" w:pos="3600"/>
+        </w:tabs>
+        <w:ind w:left="3600" w:hanging="360"/>
+      </w:pPr>
+      <w:rPr>
+        <w:rFonts w:ascii="Wingdings" w:hAnsi="Wingdings" w:hint="default"/>
+        <w:sz w:val="20"/>
+      </w:rPr>
+    </w:lvl>
+    <w:lvl w:ilvl="5" w:tentative="1">
+      <w:start w:val="1"/>
+      <w:numFmt w:val="bullet"/>
+      <w:lvlText w:val=""/>
+      <w:lvlJc w:val="left"/>
+      <w:pPr>
+        <w:tabs>
+          <w:tab w:val="num" w:pos="4320"/>
+        </w:tabs>
+        <w:ind w:left="4320" w:hanging="360"/>
+      </w:pPr>
+      <w:rPr>
+        <w:rFonts w:ascii="Wingdings" w:hAnsi="Wingdings" w:hint="default"/>
+        <w:sz w:val="20"/>
+      </w:rPr>
+    </w:lvl>
+    <w:lvl w:ilvl="6" w:tentative="1">
+      <w:start w:val="1"/>
+      <w:numFmt w:val="bullet"/>
+      <w:lvlText w:val=""/>
+      <w:lvlJc w:val="left"/>
+      <w:pPr>
+        <w:tabs>
+          <w:tab w:val="num" w:pos="5040"/>
+        </w:tabs>
+        <w:ind w:left="5040" w:hanging="360"/>
+      </w:pPr>
+      <w:rPr>
+        <w:rFonts w:ascii="Wingdings" w:hAnsi="Wingdings" w:hint="default"/>
+        <w:sz w:val="20"/>
+      </w:rPr>
+    </w:lvl>
+    <w:lvl w:ilvl="7" w:tentative="1">
+      <w:start w:val="1"/>
+      <w:numFmt w:val="bullet"/>
+      <w:lvlText w:val=""/>
+      <w:lvlJc w:val="left"/>
+      <w:pPr>
+        <w:tabs>
+          <w:tab w:val="num" w:pos="5760"/>
+        </w:tabs>
+        <w:ind w:left="5760" w:hanging="360"/>
+      </w:pPr>
+      <w:rPr>
+        <w:rFonts w:ascii="Wingdings" w:hAnsi="Wingdings" w:hint="default"/>
+        <w:sz w:val="20"/>
+      </w:rPr>
+    </w:lvl>
+    <w:lvl w:ilvl="8" w:tentative="1">
+      <w:start w:val="1"/>
+      <w:numFmt w:val="bullet"/>
+      <w:lvlText w:val=""/>
+      <w:lvlJc w:val="left"/>
+      <w:pPr>
+        <w:tabs>
+          <w:tab w:val="num" w:pos="6480"/>
+        </w:tabs>
+        <w:ind w:left="6480" w:hanging="360"/>
+      </w:pPr>
+      <w:rPr>
+        <w:rFonts w:ascii="Wingdings" w:hAnsi="Wingdings" w:hint="default"/>
+        <w:sz w:val="20"/>
+      </w:rPr>
+    </w:lvl>
+  </w:abstractNum>
+  <w:abstractNum w:abstractNumId="10" w15:restartNumberingAfterBreak="0">
     <w:nsid w:val="3D010345"/>
     <w:multiLevelType w:val="hybridMultilevel"/>
     <w:tmpl w:val="5F140060"/>
@@ -8502,7 +8816,7 @@
       </w:rPr>
     </w:lvl>
   </w:abstractNum>
-  <w:abstractNum w:abstractNumId="10" w15:restartNumberingAfterBreak="0">
+  <w:abstractNum w:abstractNumId="11" w15:restartNumberingAfterBreak="0">
     <w:nsid w:val="4E542333"/>
     <w:multiLevelType w:val="hybridMultilevel"/>
     <w:tmpl w:val="2E003600"/>
@@ -8615,7 +8929,7 @@
       </w:rPr>
     </w:lvl>
   </w:abstractNum>
-  <w:abstractNum w:abstractNumId="11" w15:restartNumberingAfterBreak="0">
+  <w:abstractNum w:abstractNumId="12" w15:restartNumberingAfterBreak="0">
     <w:nsid w:val="51ED2E7D"/>
     <w:multiLevelType w:val="hybridMultilevel"/>
     <w:tmpl w:val="2EF00784"/>
@@ -8728,7 +9042,7 @@
       </w:rPr>
     </w:lvl>
   </w:abstractNum>
-  <w:abstractNum w:abstractNumId="12" w15:restartNumberingAfterBreak="0">
+  <w:abstractNum w:abstractNumId="13" w15:restartNumberingAfterBreak="0">
     <w:nsid w:val="54811354"/>
     <w:multiLevelType w:val="hybridMultilevel"/>
     <w:tmpl w:val="83FCD732"/>
@@ -8841,7 +9155,156 @@
       </w:rPr>
     </w:lvl>
   </w:abstractNum>
-  <w:abstractNum w:abstractNumId="13" w15:restartNumberingAfterBreak="0">
+  <w:abstractNum w:abstractNumId="14" w15:restartNumberingAfterBreak="0">
+    <w:nsid w:val="59696365"/>
+    <w:multiLevelType w:val="multilevel"/>
+    <w:tmpl w:val="CC10297C"/>
+    <w:lvl w:ilvl="0">
+      <w:start w:val="1"/>
+      <w:numFmt w:val="bullet"/>
+      <w:lvlText w:val=""/>
+      <w:lvlJc w:val="left"/>
+      <w:pPr>
+        <w:tabs>
+          <w:tab w:val="num" w:pos="720"/>
+        </w:tabs>
+        <w:ind w:left="720" w:hanging="360"/>
+      </w:pPr>
+      <w:rPr>
+        <w:rFonts w:ascii="Symbol" w:hAnsi="Symbol" w:hint="default"/>
+        <w:sz w:val="20"/>
+      </w:rPr>
+    </w:lvl>
+    <w:lvl w:ilvl="1" w:tentative="1">
+      <w:start w:val="1"/>
+      <w:numFmt w:val="bullet"/>
+      <w:lvlText w:val="o"/>
+      <w:lvlJc w:val="left"/>
+      <w:pPr>
+        <w:tabs>
+          <w:tab w:val="num" w:pos="1440"/>
+        </w:tabs>
+        <w:ind w:left="1440" w:hanging="360"/>
+      </w:pPr>
+      <w:rPr>
+        <w:rFonts w:ascii="Courier New" w:hAnsi="Courier New" w:hint="default"/>
+        <w:sz w:val="20"/>
+      </w:rPr>
+    </w:lvl>
+    <w:lvl w:ilvl="2" w:tentative="1">
+      <w:start w:val="1"/>
+      <w:numFmt w:val="bullet"/>
+      <w:lvlText w:val=""/>
+      <w:lvlJc w:val="left"/>
+      <w:pPr>
+        <w:tabs>
+          <w:tab w:val="num" w:pos="2160"/>
+        </w:tabs>
+        <w:ind w:left="2160" w:hanging="360"/>
+      </w:pPr>
+      <w:rPr>
+        <w:rFonts w:ascii="Wingdings" w:hAnsi="Wingdings" w:hint="default"/>
+        <w:sz w:val="20"/>
+      </w:rPr>
+    </w:lvl>
+    <w:lvl w:ilvl="3" w:tentative="1">
+      <w:start w:val="1"/>
+      <w:numFmt w:val="bullet"/>
+      <w:lvlText w:val=""/>
+      <w:lvlJc w:val="left"/>
+      <w:pPr>
+        <w:tabs>
+          <w:tab w:val="num" w:pos="2880"/>
+        </w:tabs>
+        <w:ind w:left="2880" w:hanging="360"/>
+      </w:pPr>
+      <w:rPr>
+        <w:rFonts w:ascii="Wingdings" w:hAnsi="Wingdings" w:hint="default"/>
+        <w:sz w:val="20"/>
+      </w:rPr>
+    </w:lvl>
+    <w:lvl w:ilvl="4" w:tentative="1">
+      <w:start w:val="1"/>
+      <w:numFmt w:val="bullet"/>
+      <w:lvlText w:val=""/>
+      <w:lvlJc w:val="left"/>
+      <w:pPr>
+        <w:tabs>
+          <w:tab w:val="num" w:pos="3600"/>
+        </w:tabs>
+        <w:ind w:left="3600" w:hanging="360"/>
+      </w:pPr>
+      <w:rPr>
+        <w:rFonts w:ascii="Wingdings" w:hAnsi="Wingdings" w:hint="default"/>
+        <w:sz w:val="20"/>
+      </w:rPr>
+    </w:lvl>
+    <w:lvl w:ilvl="5" w:tentative="1">
+      <w:start w:val="1"/>
+      <w:numFmt w:val="bullet"/>
+      <w:lvlText w:val=""/>
+      <w:lvlJc w:val="left"/>
+      <w:pPr>
+        <w:tabs>
+          <w:tab w:val="num" w:pos="4320"/>
+        </w:tabs>
+        <w:ind w:left="4320" w:hanging="360"/>
+      </w:pPr>
+      <w:rPr>
+        <w:rFonts w:ascii="Wingdings" w:hAnsi="Wingdings" w:hint="default"/>
+        <w:sz w:val="20"/>
+      </w:rPr>
+    </w:lvl>
+    <w:lvl w:ilvl="6" w:tentative="1">
+      <w:start w:val="1"/>
+      <w:numFmt w:val="bullet"/>
+      <w:lvlText w:val=""/>
+      <w:lvlJc w:val="left"/>
+      <w:pPr>
+        <w:tabs>
+          <w:tab w:val="num" w:pos="5040"/>
+        </w:tabs>
+        <w:ind w:left="5040" w:hanging="360"/>
+      </w:pPr>
+      <w:rPr>
+        <w:rFonts w:ascii="Wingdings" w:hAnsi="Wingdings" w:hint="default"/>
+        <w:sz w:val="20"/>
+      </w:rPr>
+    </w:lvl>
+    <w:lvl w:ilvl="7" w:tentative="1">
+      <w:start w:val="1"/>
+      <w:numFmt w:val="bullet"/>
+      <w:lvlText w:val=""/>
+      <w:lvlJc w:val="left"/>
+      <w:pPr>
+        <w:tabs>
+          <w:tab w:val="num" w:pos="5760"/>
+        </w:tabs>
+        <w:ind w:left="5760" w:hanging="360"/>
+      </w:pPr>
+      <w:rPr>
+        <w:rFonts w:ascii="Wingdings" w:hAnsi="Wingdings" w:hint="default"/>
+        <w:sz w:val="20"/>
+      </w:rPr>
+    </w:lvl>
+    <w:lvl w:ilvl="8" w:tentative="1">
+      <w:start w:val="1"/>
+      <w:numFmt w:val="bullet"/>
+      <w:lvlText w:val=""/>
+      <w:lvlJc w:val="left"/>
+      <w:pPr>
+        <w:tabs>
+          <w:tab w:val="num" w:pos="6480"/>
+        </w:tabs>
+        <w:ind w:left="6480" w:hanging="360"/>
+      </w:pPr>
+      <w:rPr>
+        <w:rFonts w:ascii="Wingdings" w:hAnsi="Wingdings" w:hint="default"/>
+        <w:sz w:val="20"/>
+      </w:rPr>
+    </w:lvl>
+  </w:abstractNum>
+  <w:abstractNum w:abstractNumId="15" w15:restartNumberingAfterBreak="0">
     <w:nsid w:val="5B370DC2"/>
     <w:multiLevelType w:val="multilevel"/>
     <w:tmpl w:val="03FE80FC"/>
@@ -8990,7 +9453,7 @@
       </w:rPr>
     </w:lvl>
   </w:abstractNum>
-  <w:abstractNum w:abstractNumId="14" w15:restartNumberingAfterBreak="0">
+  <w:abstractNum w:abstractNumId="16" w15:restartNumberingAfterBreak="0">
     <w:nsid w:val="5C934C91"/>
     <w:multiLevelType w:val="hybridMultilevel"/>
     <w:tmpl w:val="2DFEECD0"/>
@@ -9103,7 +9566,156 @@
       </w:rPr>
     </w:lvl>
   </w:abstractNum>
-  <w:abstractNum w:abstractNumId="15" w15:restartNumberingAfterBreak="0">
+  <w:abstractNum w:abstractNumId="17" w15:restartNumberingAfterBreak="0">
+    <w:nsid w:val="631C7130"/>
+    <w:multiLevelType w:val="multilevel"/>
+    <w:tmpl w:val="1C3A5B22"/>
+    <w:lvl w:ilvl="0">
+      <w:start w:val="1"/>
+      <w:numFmt w:val="bullet"/>
+      <w:lvlText w:val=""/>
+      <w:lvlJc w:val="left"/>
+      <w:pPr>
+        <w:tabs>
+          <w:tab w:val="num" w:pos="720"/>
+        </w:tabs>
+        <w:ind w:left="720" w:hanging="360"/>
+      </w:pPr>
+      <w:rPr>
+        <w:rFonts w:ascii="Symbol" w:hAnsi="Symbol" w:hint="default"/>
+        <w:sz w:val="20"/>
+      </w:rPr>
+    </w:lvl>
+    <w:lvl w:ilvl="1" w:tentative="1">
+      <w:start w:val="1"/>
+      <w:numFmt w:val="bullet"/>
+      <w:lvlText w:val="o"/>
+      <w:lvlJc w:val="left"/>
+      <w:pPr>
+        <w:tabs>
+          <w:tab w:val="num" w:pos="1440"/>
+        </w:tabs>
+        <w:ind w:left="1440" w:hanging="360"/>
+      </w:pPr>
+      <w:rPr>
+        <w:rFonts w:ascii="Courier New" w:hAnsi="Courier New" w:hint="default"/>
+        <w:sz w:val="20"/>
+      </w:rPr>
+    </w:lvl>
+    <w:lvl w:ilvl="2" w:tentative="1">
+      <w:start w:val="1"/>
+      <w:numFmt w:val="bullet"/>
+      <w:lvlText w:val=""/>
+      <w:lvlJc w:val="left"/>
+      <w:pPr>
+        <w:tabs>
+          <w:tab w:val="num" w:pos="2160"/>
+        </w:tabs>
+        <w:ind w:left="2160" w:hanging="360"/>
+      </w:pPr>
+      <w:rPr>
+        <w:rFonts w:ascii="Wingdings" w:hAnsi="Wingdings" w:hint="default"/>
+        <w:sz w:val="20"/>
+      </w:rPr>
+    </w:lvl>
+    <w:lvl w:ilvl="3" w:tentative="1">
+      <w:start w:val="1"/>
+      <w:numFmt w:val="bullet"/>
+      <w:lvlText w:val=""/>
+      <w:lvlJc w:val="left"/>
+      <w:pPr>
+        <w:tabs>
+          <w:tab w:val="num" w:pos="2880"/>
+        </w:tabs>
+        <w:ind w:left="2880" w:hanging="360"/>
+      </w:pPr>
+      <w:rPr>
+        <w:rFonts w:ascii="Wingdings" w:hAnsi="Wingdings" w:hint="default"/>
+        <w:sz w:val="20"/>
+      </w:rPr>
+    </w:lvl>
+    <w:lvl w:ilvl="4" w:tentative="1">
+      <w:start w:val="1"/>
+      <w:numFmt w:val="bullet"/>
+      <w:lvlText w:val=""/>
+      <w:lvlJc w:val="left"/>
+      <w:pPr>
+        <w:tabs>
+          <w:tab w:val="num" w:pos="3600"/>
+        </w:tabs>
+        <w:ind w:left="3600" w:hanging="360"/>
+      </w:pPr>
+      <w:rPr>
+        <w:rFonts w:ascii="Wingdings" w:hAnsi="Wingdings" w:hint="default"/>
+        <w:sz w:val="20"/>
+      </w:rPr>
+    </w:lvl>
+    <w:lvl w:ilvl="5" w:tentative="1">
+      <w:start w:val="1"/>
+      <w:numFmt w:val="bullet"/>
+      <w:lvlText w:val=""/>
+      <w:lvlJc w:val="left"/>
+      <w:pPr>
+        <w:tabs>
+          <w:tab w:val="num" w:pos="4320"/>
+        </w:tabs>
+        <w:ind w:left="4320" w:hanging="360"/>
+      </w:pPr>
+      <w:rPr>
+        <w:rFonts w:ascii="Wingdings" w:hAnsi="Wingdings" w:hint="default"/>
+        <w:sz w:val="20"/>
+      </w:rPr>
+    </w:lvl>
+    <w:lvl w:ilvl="6" w:tentative="1">
+      <w:start w:val="1"/>
+      <w:numFmt w:val="bullet"/>
+      <w:lvlText w:val=""/>
+      <w:lvlJc w:val="left"/>
+      <w:pPr>
+        <w:tabs>
+          <w:tab w:val="num" w:pos="5040"/>
+        </w:tabs>
+        <w:ind w:left="5040" w:hanging="360"/>
+      </w:pPr>
+      <w:rPr>
+        <w:rFonts w:ascii="Wingdings" w:hAnsi="Wingdings" w:hint="default"/>
+        <w:sz w:val="20"/>
+      </w:rPr>
+    </w:lvl>
+    <w:lvl w:ilvl="7" w:tentative="1">
+      <w:start w:val="1"/>
+      <w:numFmt w:val="bullet"/>
+      <w:lvlText w:val=""/>
+      <w:lvlJc w:val="left"/>
+      <w:pPr>
+        <w:tabs>
+          <w:tab w:val="num" w:pos="5760"/>
+        </w:tabs>
+        <w:ind w:left="5760" w:hanging="360"/>
+      </w:pPr>
+      <w:rPr>
+        <w:rFonts w:ascii="Wingdings" w:hAnsi="Wingdings" w:hint="default"/>
+        <w:sz w:val="20"/>
+      </w:rPr>
+    </w:lvl>
+    <w:lvl w:ilvl="8" w:tentative="1">
+      <w:start w:val="1"/>
+      <w:numFmt w:val="bullet"/>
+      <w:lvlText w:val=""/>
+      <w:lvlJc w:val="left"/>
+      <w:pPr>
+        <w:tabs>
+          <w:tab w:val="num" w:pos="6480"/>
+        </w:tabs>
+        <w:ind w:left="6480" w:hanging="360"/>
+      </w:pPr>
+      <w:rPr>
+        <w:rFonts w:ascii="Wingdings" w:hAnsi="Wingdings" w:hint="default"/>
+        <w:sz w:val="20"/>
+      </w:rPr>
+    </w:lvl>
+  </w:abstractNum>
+  <w:abstractNum w:abstractNumId="18" w15:restartNumberingAfterBreak="0">
     <w:nsid w:val="632F46D1"/>
     <w:multiLevelType w:val="hybridMultilevel"/>
     <w:tmpl w:val="9A10D2F0"/>
@@ -9216,7 +9828,7 @@
       </w:rPr>
     </w:lvl>
   </w:abstractNum>
-  <w:abstractNum w:abstractNumId="16" w15:restartNumberingAfterBreak="0">
+  <w:abstractNum w:abstractNumId="19" w15:restartNumberingAfterBreak="0">
     <w:nsid w:val="67BC70E3"/>
     <w:multiLevelType w:val="hybridMultilevel"/>
     <w:tmpl w:val="28FC9A8A"/>
@@ -9329,7 +9941,7 @@
       </w:rPr>
     </w:lvl>
   </w:abstractNum>
-  <w:abstractNum w:abstractNumId="17" w15:restartNumberingAfterBreak="0">
+  <w:abstractNum w:abstractNumId="20" w15:restartNumberingAfterBreak="0">
     <w:nsid w:val="6BCC35A5"/>
     <w:multiLevelType w:val="hybridMultilevel"/>
     <w:tmpl w:val="92F0A894"/>
@@ -9442,7 +10054,7 @@
       </w:rPr>
     </w:lvl>
   </w:abstractNum>
-  <w:abstractNum w:abstractNumId="18" w15:restartNumberingAfterBreak="0">
+  <w:abstractNum w:abstractNumId="21" w15:restartNumberingAfterBreak="0">
     <w:nsid w:val="6EF0363A"/>
     <w:multiLevelType w:val="hybridMultilevel"/>
     <w:tmpl w:val="9CC6DE28"/>
@@ -9555,7 +10167,7 @@
       </w:rPr>
     </w:lvl>
   </w:abstractNum>
-  <w:abstractNum w:abstractNumId="19" w15:restartNumberingAfterBreak="0">
+  <w:abstractNum w:abstractNumId="22" w15:restartNumberingAfterBreak="0">
     <w:nsid w:val="72B61344"/>
     <w:multiLevelType w:val="multilevel"/>
     <w:tmpl w:val="AD5879DE"/>
@@ -9704,7 +10316,156 @@
       </w:rPr>
     </w:lvl>
   </w:abstractNum>
-  <w:abstractNum w:abstractNumId="20" w15:restartNumberingAfterBreak="0">
+  <w:abstractNum w:abstractNumId="23" w15:restartNumberingAfterBreak="0">
+    <w:nsid w:val="72EA3EC8"/>
+    <w:multiLevelType w:val="multilevel"/>
+    <w:tmpl w:val="7EE819A8"/>
+    <w:lvl w:ilvl="0">
+      <w:start w:val="1"/>
+      <w:numFmt w:val="bullet"/>
+      <w:lvlText w:val=""/>
+      <w:lvlJc w:val="left"/>
+      <w:pPr>
+        <w:tabs>
+          <w:tab w:val="num" w:pos="720"/>
+        </w:tabs>
+        <w:ind w:left="720" w:hanging="360"/>
+      </w:pPr>
+      <w:rPr>
+        <w:rFonts w:ascii="Symbol" w:hAnsi="Symbol" w:hint="default"/>
+        <w:sz w:val="20"/>
+      </w:rPr>
+    </w:lvl>
+    <w:lvl w:ilvl="1" w:tentative="1">
+      <w:start w:val="1"/>
+      <w:numFmt w:val="bullet"/>
+      <w:lvlText w:val="o"/>
+      <w:lvlJc w:val="left"/>
+      <w:pPr>
+        <w:tabs>
+          <w:tab w:val="num" w:pos="1440"/>
+        </w:tabs>
+        <w:ind w:left="1440" w:hanging="360"/>
+      </w:pPr>
+      <w:rPr>
+        <w:rFonts w:ascii="Courier New" w:hAnsi="Courier New" w:hint="default"/>
+        <w:sz w:val="20"/>
+      </w:rPr>
+    </w:lvl>
+    <w:lvl w:ilvl="2" w:tentative="1">
+      <w:start w:val="1"/>
+      <w:numFmt w:val="bullet"/>
+      <w:lvlText w:val=""/>
+      <w:lvlJc w:val="left"/>
+      <w:pPr>
+        <w:tabs>
+          <w:tab w:val="num" w:pos="2160"/>
+        </w:tabs>
+        <w:ind w:left="2160" w:hanging="360"/>
+      </w:pPr>
+      <w:rPr>
+        <w:rFonts w:ascii="Wingdings" w:hAnsi="Wingdings" w:hint="default"/>
+        <w:sz w:val="20"/>
+      </w:rPr>
+    </w:lvl>
+    <w:lvl w:ilvl="3" w:tentative="1">
+      <w:start w:val="1"/>
+      <w:numFmt w:val="bullet"/>
+      <w:lvlText w:val=""/>
+      <w:lvlJc w:val="left"/>
+      <w:pPr>
+        <w:tabs>
+          <w:tab w:val="num" w:pos="2880"/>
+        </w:tabs>
+        <w:ind w:left="2880" w:hanging="360"/>
+      </w:pPr>
+      <w:rPr>
+        <w:rFonts w:ascii="Wingdings" w:hAnsi="Wingdings" w:hint="default"/>
+        <w:sz w:val="20"/>
+      </w:rPr>
+    </w:lvl>
+    <w:lvl w:ilvl="4" w:tentative="1">
+      <w:start w:val="1"/>
+      <w:numFmt w:val="bullet"/>
+      <w:lvlText w:val=""/>
+      <w:lvlJc w:val="left"/>
+      <w:pPr>
+        <w:tabs>
+          <w:tab w:val="num" w:pos="3600"/>
+        </w:tabs>
+        <w:ind w:left="3600" w:hanging="360"/>
+      </w:pPr>
+      <w:rPr>
+        <w:rFonts w:ascii="Wingdings" w:hAnsi="Wingdings" w:hint="default"/>
+        <w:sz w:val="20"/>
+      </w:rPr>
+    </w:lvl>
+    <w:lvl w:ilvl="5" w:tentative="1">
+      <w:start w:val="1"/>
+      <w:numFmt w:val="bullet"/>
+      <w:lvlText w:val=""/>
+      <w:lvlJc w:val="left"/>
+      <w:pPr>
+        <w:tabs>
+          <w:tab w:val="num" w:pos="4320"/>
+        </w:tabs>
+        <w:ind w:left="4320" w:hanging="360"/>
+      </w:pPr>
+      <w:rPr>
+        <w:rFonts w:ascii="Wingdings" w:hAnsi="Wingdings" w:hint="default"/>
+        <w:sz w:val="20"/>
+      </w:rPr>
+    </w:lvl>
+    <w:lvl w:ilvl="6" w:tentative="1">
+      <w:start w:val="1"/>
+      <w:numFmt w:val="bullet"/>
+      <w:lvlText w:val=""/>
+      <w:lvlJc w:val="left"/>
+      <w:pPr>
+        <w:tabs>
+          <w:tab w:val="num" w:pos="5040"/>
+        </w:tabs>
+        <w:ind w:left="5040" w:hanging="360"/>
+      </w:pPr>
+      <w:rPr>
+        <w:rFonts w:ascii="Wingdings" w:hAnsi="Wingdings" w:hint="default"/>
+        <w:sz w:val="20"/>
+      </w:rPr>
+    </w:lvl>
+    <w:lvl w:ilvl="7" w:tentative="1">
+      <w:start w:val="1"/>
+      <w:numFmt w:val="bullet"/>
+      <w:lvlText w:val=""/>
+      <w:lvlJc w:val="left"/>
+      <w:pPr>
+        <w:tabs>
+          <w:tab w:val="num" w:pos="5760"/>
+        </w:tabs>
+        <w:ind w:left="5760" w:hanging="360"/>
+      </w:pPr>
+      <w:rPr>
+        <w:rFonts w:ascii="Wingdings" w:hAnsi="Wingdings" w:hint="default"/>
+        <w:sz w:val="20"/>
+      </w:rPr>
+    </w:lvl>
+    <w:lvl w:ilvl="8" w:tentative="1">
+      <w:start w:val="1"/>
+      <w:numFmt w:val="bullet"/>
+      <w:lvlText w:val=""/>
+      <w:lvlJc w:val="left"/>
+      <w:pPr>
+        <w:tabs>
+          <w:tab w:val="num" w:pos="6480"/>
+        </w:tabs>
+        <w:ind w:left="6480" w:hanging="360"/>
+      </w:pPr>
+      <w:rPr>
+        <w:rFonts w:ascii="Wingdings" w:hAnsi="Wingdings" w:hint="default"/>
+        <w:sz w:val="20"/>
+      </w:rPr>
+    </w:lvl>
+  </w:abstractNum>
+  <w:abstractNum w:abstractNumId="24" w15:restartNumberingAfterBreak="0">
     <w:nsid w:val="789373D0"/>
     <w:multiLevelType w:val="hybridMultilevel"/>
     <w:tmpl w:val="9BACC508"/>
@@ -9817,7 +10578,7 @@
       </w:rPr>
     </w:lvl>
   </w:abstractNum>
-  <w:abstractNum w:abstractNumId="21" w15:restartNumberingAfterBreak="0">
+  <w:abstractNum w:abstractNumId="25" w15:restartNumberingAfterBreak="0">
     <w:nsid w:val="7D9D4C1E"/>
     <w:multiLevelType w:val="hybridMultilevel"/>
     <w:tmpl w:val="1E90CDB2"/>
@@ -9930,17 +10691,130 @@
       </w:rPr>
     </w:lvl>
   </w:abstractNum>
+  <w:abstractNum w:abstractNumId="26" w15:restartNumberingAfterBreak="0">
+    <w:nsid w:val="7F361C59"/>
+    <w:multiLevelType w:val="hybridMultilevel"/>
+    <w:tmpl w:val="8CF4D126"/>
+    <w:lvl w:ilvl="0" w:tplc="04090001">
+      <w:start w:val="1"/>
+      <w:numFmt w:val="bullet"/>
+      <w:lvlText w:val=""/>
+      <w:lvlJc w:val="left"/>
+      <w:pPr>
+        <w:ind w:left="720" w:hanging="360"/>
+      </w:pPr>
+      <w:rPr>
+        <w:rFonts w:ascii="Symbol" w:hAnsi="Symbol" w:hint="default"/>
+      </w:rPr>
+    </w:lvl>
+    <w:lvl w:ilvl="1" w:tplc="04090003" w:tentative="1">
+      <w:start w:val="1"/>
+      <w:numFmt w:val="bullet"/>
+      <w:lvlText w:val="o"/>
+      <w:lvlJc w:val="left"/>
+      <w:pPr>
+        <w:ind w:left="1440" w:hanging="360"/>
+      </w:pPr>
+      <w:rPr>
+        <w:rFonts w:ascii="Courier New" w:hAnsi="Courier New" w:cs="Courier New" w:hint="default"/>
+      </w:rPr>
+    </w:lvl>
+    <w:lvl w:ilvl="2" w:tplc="04090005" w:tentative="1">
+      <w:start w:val="1"/>
+      <w:numFmt w:val="bullet"/>
+      <w:lvlText w:val=""/>
+      <w:lvlJc w:val="left"/>
+      <w:pPr>
+        <w:ind w:left="2160" w:hanging="360"/>
+      </w:pPr>
+      <w:rPr>
+        <w:rFonts w:ascii="Wingdings" w:hAnsi="Wingdings" w:hint="default"/>
+      </w:rPr>
+    </w:lvl>
+    <w:lvl w:ilvl="3" w:tplc="04090001" w:tentative="1">
+      <w:start w:val="1"/>
+      <w:numFmt w:val="bullet"/>
+      <w:lvlText w:val=""/>
+      <w:lvlJc w:val="left"/>
+      <w:pPr>
+        <w:ind w:left="2880" w:hanging="360"/>
+      </w:pPr>
+      <w:rPr>
+        <w:rFonts w:ascii="Symbol" w:hAnsi="Symbol" w:hint="default"/>
+      </w:rPr>
+    </w:lvl>
+    <w:lvl w:ilvl="4" w:tplc="04090003" w:tentative="1">
+      <w:start w:val="1"/>
+      <w:numFmt w:val="bullet"/>
+      <w:lvlText w:val="o"/>
+      <w:lvlJc w:val="left"/>
+      <w:pPr>
+        <w:ind w:left="3600" w:hanging="360"/>
+      </w:pPr>
+      <w:rPr>
+        <w:rFonts w:ascii="Courier New" w:hAnsi="Courier New" w:cs="Courier New" w:hint="default"/>
+      </w:rPr>
+    </w:lvl>
+    <w:lvl w:ilvl="5" w:tplc="04090005" w:tentative="1">
+      <w:start w:val="1"/>
+      <w:numFmt w:val="bullet"/>
+      <w:lvlText w:val=""/>
+      <w:lvlJc w:val="left"/>
+      <w:pPr>
+        <w:ind w:left="4320" w:hanging="360"/>
+      </w:pPr>
+      <w:rPr>
+        <w:rFonts w:ascii="Wingdings" w:hAnsi="Wingdings" w:hint="default"/>
+      </w:rPr>
+    </w:lvl>
+    <w:lvl w:ilvl="6" w:tplc="04090001" w:tentative="1">
+      <w:start w:val="1"/>
+      <w:numFmt w:val="bullet"/>
+      <w:lvlText w:val=""/>
+      <w:lvlJc w:val="left"/>
+      <w:pPr>
+        <w:ind w:left="5040" w:hanging="360"/>
+      </w:pPr>
+      <w:rPr>
+        <w:rFonts w:ascii="Symbol" w:hAnsi="Symbol" w:hint="default"/>
+      </w:rPr>
+    </w:lvl>
+    <w:lvl w:ilvl="7" w:tplc="04090003" w:tentative="1">
+      <w:start w:val="1"/>
+      <w:numFmt w:val="bullet"/>
+      <w:lvlText w:val="o"/>
+      <w:lvlJc w:val="left"/>
+      <w:pPr>
+        <w:ind w:left="5760" w:hanging="360"/>
+      </w:pPr>
+      <w:rPr>
+        <w:rFonts w:ascii="Courier New" w:hAnsi="Courier New" w:cs="Courier New" w:hint="default"/>
+      </w:rPr>
+    </w:lvl>
+    <w:lvl w:ilvl="8" w:tplc="04090005" w:tentative="1">
+      <w:start w:val="1"/>
+      <w:numFmt w:val="bullet"/>
+      <w:lvlText w:val=""/>
+      <w:lvlJc w:val="left"/>
+      <w:pPr>
+        <w:ind w:left="6480" w:hanging="360"/>
+      </w:pPr>
+      <w:rPr>
+        <w:rFonts w:ascii="Wingdings" w:hAnsi="Wingdings" w:hint="default"/>
+      </w:rPr>
+    </w:lvl>
+  </w:abstractNum>
   <w:num w:numId="1" w16cid:durableId="634338226">
-    <w:abstractNumId w:val="14"/>
+    <w:abstractNumId w:val="16"/>
   </w:num>
   <w:num w:numId="2" w16cid:durableId="1338463573">
-    <w:abstractNumId w:val="16"/>
+    <w:abstractNumId w:val="19"/>
   </w:num>
   <w:num w:numId="3" w16cid:durableId="1655639285">
-    <w:abstractNumId w:val="11"/>
+    <w:abstractNumId w:val="12"/>
   </w:num>
   <w:num w:numId="4" w16cid:durableId="14812739">
-    <w:abstractNumId w:val="15"/>
+    <w:abstractNumId w:val="18"/>
   </w:num>
   <w:num w:numId="5" w16cid:durableId="1974674738">
     <w:abstractNumId w:val="2"/>
@@ -9949,19 +10823,19 @@
     <w:abstractNumId w:val="1"/>
   </w:num>
   <w:num w:numId="7" w16cid:durableId="1656031105">
-    <w:abstractNumId w:val="13"/>
+    <w:abstractNumId w:val="15"/>
   </w:num>
   <w:num w:numId="8" w16cid:durableId="92433950">
     <w:abstractNumId w:val="6"/>
   </w:num>
   <w:num w:numId="9" w16cid:durableId="513039001">
-    <w:abstractNumId w:val="20"/>
+    <w:abstractNumId w:val="24"/>
   </w:num>
   <w:num w:numId="10" w16cid:durableId="1024282866">
     <w:abstractNumId w:val="0"/>
   </w:num>
   <w:num w:numId="11" w16cid:durableId="406196409">
-    <w:abstractNumId w:val="9"/>
+    <w:abstractNumId w:val="10"/>
   </w:num>
   <w:num w:numId="12" w16cid:durableId="1214122996">
     <w:abstractNumId w:val="7"/>
@@ -9970,31 +10844,46 @@
     <w:abstractNumId w:val="3"/>
   </w:num>
   <w:num w:numId="14" w16cid:durableId="1428576072">
-    <w:abstractNumId w:val="19"/>
+    <w:abstractNumId w:val="22"/>
   </w:num>
   <w:num w:numId="15" w16cid:durableId="513959940">
     <w:abstractNumId w:val="5"/>
   </w:num>
   <w:num w:numId="16" w16cid:durableId="289362757">
-    <w:abstractNumId w:val="12"/>
+    <w:abstractNumId w:val="13"/>
   </w:num>
   <w:num w:numId="17" w16cid:durableId="337385661">
-    <w:abstractNumId w:val="10"/>
+    <w:abstractNumId w:val="11"/>
   </w:num>
   <w:num w:numId="18" w16cid:durableId="1251350900">
     <w:abstractNumId w:val="8"/>
   </w:num>
   <w:num w:numId="19" w16cid:durableId="2089303850">
-    <w:abstractNumId w:val="21"/>
+    <w:abstractNumId w:val="25"/>
   </w:num>
   <w:num w:numId="20" w16cid:durableId="488786948">
-    <w:abstractNumId w:val="17"/>
+    <w:abstractNumId w:val="20"/>
   </w:num>
   <w:num w:numId="21" w16cid:durableId="745418956">
     <w:abstractNumId w:val="4"/>
   </w:num>
   <w:num w:numId="22" w16cid:durableId="1903329191">
-    <w:abstractNumId w:val="18"/>
+    <w:abstractNumId w:val="21"/>
+  </w:num>
+  <w:num w:numId="23" w16cid:durableId="217673825">
+    <w:abstractNumId w:val="26"/>
+  </w:num>
+  <w:num w:numId="24" w16cid:durableId="1514606084">
+    <w:abstractNumId w:val="17"/>
+  </w:num>
+  <w:num w:numId="25" w16cid:durableId="1369262925">
+    <w:abstractNumId w:val="23"/>
+  </w:num>
+  <w:num w:numId="26" w16cid:durableId="1927496339">
+    <w:abstractNumId w:val="14"/>
+  </w:num>
+  <w:num w:numId="27" w16cid:durableId="716853119">
+    <w:abstractNumId w:val="9"/>
   </w:num>
 </w:numbering>
 </file>

</xml_diff>